<commit_message>
Rewrite usage report for log officer
Removes all technical/setup content. New version covers only
day-to-day app use: inventory status, on-hand updates via loans
and order approval, generating and locking orders, shipment tracking,
and the monthly order cycle workflow.

https://claude.ai/code/session_011fwVFzxjse3LdyLjxSezh3
</commit_message>
<xml_diff>
--- a/USAGE_REPORT.docx
+++ b/USAGE_REPORT.docx
@@ -19,13 +19,10 @@
         <w:pStyle w:val="Heading1"/>
       </w:pPr>
       <w:r>
-        <w:t>Usage Report</w:t>
+        <w:t>Usage Guide</w:t>
       </w:r>
     </w:p>
     <w:p>
-      <w:pPr>
-        <w:jc w:val="left"/>
-      </w:pPr>
       <w:r>
         <w:rPr>
           <w:b/>
@@ -46,21 +43,11 @@
         <w:t>14 April 2026</w:t>
         <w:br/>
       </w:r>
-      <w:r>
-        <w:rPr>
-          <w:b/>
-        </w:rPr>
-        <w:t xml:space="preserve">Subject: </w:t>
-      </w:r>
-      <w:r>
-        <w:t>Application Overview and Standard Operating Procedures</w:t>
-        <w:br/>
-      </w:r>
     </w:p>
     <w:p>
       <w:pPr>
         <w:pBdr>
-          <w:bottom w:val="single" w:sz="6" w:space="1" w:color="999999"/>
+          <w:bottom w:val="single" w:sz="6" w:space="1" w:color="AAAAAA"/>
         </w:pBdr>
       </w:pPr>
     </w:p>
@@ -69,12 +56,17 @@
         <w:pStyle w:val="Heading2"/>
       </w:pPr>
       <w:r>
-        <w:t>1. Purpose</w:t>
+        <w:t>Overview</w:t>
       </w:r>
     </w:p>
     <w:p>
       <w:r>
-        <w:t>The Overlake CAP Logistics Manager is a web-based tool for managing the Overlake Composite Squadron's inventory of CAP uniform items, insignia, ribbons, and patches. It provides a single interface to monitor stock levels, generate orders, track inbound shipments, and record received goods back into the inventory sheet — all tied to a shared Google Sheet as the live data source.</w:t>
+        <w:t>The Overlake CAP Logistics Manager is a web app for tracking squadron inventory, logging loans, generating monthly supply orders, and receiving shipments. It reads inventory data from the squadron's shared Google Sheet and writes back to it when orders are approved or loans are recorded.</w:t>
+      </w:r>
+    </w:p>
+    <w:p>
+      <w:r>
+        <w:t>There are five tabs: Inventory, Loans, Order Generator, Monitoring, and Setup.</w:t>
       </w:r>
     </w:p>
     <w:p>
@@ -82,1715 +74,12 @@
         <w:pStyle w:val="Heading2"/>
       </w:pPr>
       <w:r>
-        <w:t>2. Accessing the Application</w:t>
+        <w:t>Inventory Tab</w:t>
       </w:r>
     </w:p>
     <w:p>
       <w:r>
-        <w:t>The application runs in any modern web browser. No installation is required by end users.</w:t>
-      </w:r>
-    </w:p>
-    <w:p>
-      <w:r>
-        <w:rPr>
-          <w:b/>
-        </w:rPr>
-        <w:t xml:space="preserve">Development / local instance: </w:t>
-      </w:r>
-      <w:r>
-        <w:t xml:space="preserve">http://localhost:5173  (after running </w:t>
-      </w:r>
-      <w:r>
-        <w:rPr>
-          <w:rFonts w:ascii="Courier New" w:hAnsi="Courier New"/>
-        </w:rPr>
-        <w:t>npm run dev</w:t>
-      </w:r>
-      <w:r>
-        <w:t>)</w:t>
-      </w:r>
-    </w:p>
-    <w:p>
-      <w:r>
-        <w:rPr>
-          <w:b/>
-        </w:rPr>
-        <w:t xml:space="preserve">Production deployment: </w:t>
-      </w:r>
-      <w:r>
-        <w:t>Hosted on Vercel; the deployment URL is set by the project owner.</w:t>
-      </w:r>
-    </w:p>
-    <w:p>
-      <w:r>
-        <w:t>On first load the app shows a Connect Sheet prompt. A valid Google Sheet ID must be provided before any live data appears (see Section 5 for setup).</w:t>
-      </w:r>
-    </w:p>
-    <w:p>
-      <w:pPr>
-        <w:pStyle w:val="Heading2"/>
-      </w:pPr>
-      <w:r>
-        <w:t>3. Interface Overview</w:t>
-      </w:r>
-    </w:p>
-    <w:p>
-      <w:r>
-        <w:t>The application is a single-page app divided into four tabs across the top navigation bar:</w:t>
-      </w:r>
-    </w:p>
-    <w:tbl>
-      <w:tblPr>
-        <w:tblStyle w:val="TableGrid"/>
-        <w:tblW w:type="auto" w:w="0"/>
-        <w:tblLook w:firstColumn="1" w:firstRow="1" w:lastColumn="0" w:lastRow="0" w:noHBand="0" w:noVBand="1" w:val="04A0"/>
-      </w:tblPr>
-      <w:tblGrid>
-        <w:gridCol w:w="2928"/>
-        <w:gridCol w:w="2928"/>
-        <w:gridCol w:w="2928"/>
-      </w:tblGrid>
-      <w:tr>
-        <w:tc>
-          <w:tcPr>
-            <w:tcW w:type="dxa" w:w="2928"/>
-            <w:shd w:val="clear" w:color="auto" w:fill="D9E1F2"/>
-          </w:tcPr>
-          <w:p>
-            <w:r/>
-            <w:r>
-              <w:rPr>
-                <w:b/>
-              </w:rPr>
-              <w:t>Tab</w:t>
-            </w:r>
-          </w:p>
-        </w:tc>
-        <w:tc>
-          <w:tcPr>
-            <w:tcW w:type="dxa" w:w="2928"/>
-            <w:shd w:val="clear" w:color="auto" w:fill="D9E1F2"/>
-          </w:tcPr>
-          <w:p>
-            <w:r/>
-            <w:r>
-              <w:rPr>
-                <w:b/>
-              </w:rPr>
-              <w:t>Icon</w:t>
-            </w:r>
-          </w:p>
-        </w:tc>
-        <w:tc>
-          <w:tcPr>
-            <w:tcW w:type="dxa" w:w="2928"/>
-            <w:shd w:val="clear" w:color="auto" w:fill="D9E1F2"/>
-          </w:tcPr>
-          <w:p>
-            <w:r/>
-            <w:r>
-              <w:rPr>
-                <w:b/>
-              </w:rPr>
-              <w:t>Purpose</w:t>
-            </w:r>
-          </w:p>
-        </w:tc>
-      </w:tr>
-      <w:tr>
-        <w:tc>
-          <w:tcPr>
-            <w:tcW w:type="dxa" w:w="2928"/>
-          </w:tcPr>
-          <w:p>
-            <w:r>
-              <w:t>Inventory</w:t>
-            </w:r>
-          </w:p>
-        </w:tc>
-        <w:tc>
-          <w:tcPr>
-            <w:tcW w:type="dxa" w:w="2928"/>
-          </w:tcPr>
-          <w:p>
-            <w:r>
-              <w:t>📦</w:t>
-            </w:r>
-          </w:p>
-        </w:tc>
-        <w:tc>
-          <w:tcPr>
-            <w:tcW w:type="dxa" w:w="2928"/>
-          </w:tcPr>
-          <w:p>
-            <w:r>
-              <w:t>View current stock levels and status</w:t>
-            </w:r>
-          </w:p>
-        </w:tc>
-      </w:tr>
-      <w:tr>
-        <w:tc>
-          <w:tcPr>
-            <w:tcW w:type="dxa" w:w="2928"/>
-          </w:tcPr>
-          <w:p>
-            <w:r>
-              <w:t>Order</w:t>
-            </w:r>
-          </w:p>
-        </w:tc>
-        <w:tc>
-          <w:tcPr>
-            <w:tcW w:type="dxa" w:w="2928"/>
-          </w:tcPr>
-          <w:p>
-            <w:r>
-              <w:t>🛒</w:t>
-            </w:r>
-          </w:p>
-        </w:tc>
-        <w:tc>
-          <w:tcPr>
-            <w:tcW w:type="dxa" w:w="2928"/>
-          </w:tcPr>
-          <w:p>
-            <w:r>
-              <w:t>Review and export the next supply order</w:t>
-            </w:r>
-          </w:p>
-        </w:tc>
-      </w:tr>
-      <w:tr>
-        <w:tc>
-          <w:tcPr>
-            <w:tcW w:type="dxa" w:w="2928"/>
-          </w:tcPr>
-          <w:p>
-            <w:r>
-              <w:t>Monitoring</w:t>
-            </w:r>
-          </w:p>
-        </w:tc>
-        <w:tc>
-          <w:tcPr>
-            <w:tcW w:type="dxa" w:w="2928"/>
-          </w:tcPr>
-          <w:p>
-            <w:r>
-              <w:t>📡</w:t>
-            </w:r>
-          </w:p>
-        </w:tc>
-        <w:tc>
-          <w:tcPr>
-            <w:tcW w:type="dxa" w:w="2928"/>
-          </w:tcPr>
-          <w:p>
-            <w:r>
-              <w:t>Track shipments and approve received orders</w:t>
-            </w:r>
-          </w:p>
-        </w:tc>
-      </w:tr>
-      <w:tr>
-        <w:tc>
-          <w:tcPr>
-            <w:tcW w:type="dxa" w:w="2928"/>
-          </w:tcPr>
-          <w:p>
-            <w:r>
-              <w:t>Setup</w:t>
-            </w:r>
-          </w:p>
-        </w:tc>
-        <w:tc>
-          <w:tcPr>
-            <w:tcW w:type="dxa" w:w="2928"/>
-          </w:tcPr>
-          <w:p>
-            <w:r>
-              <w:t>⚙</w:t>
-            </w:r>
-          </w:p>
-        </w:tc>
-        <w:tc>
-          <w:tcPr>
-            <w:tcW w:type="dxa" w:w="2928"/>
-          </w:tcPr>
-          <w:p>
-            <w:r>
-              <w:t>Connect the Google Sheet and read onboarding instructions</w:t>
-            </w:r>
-          </w:p>
-        </w:tc>
-      </w:tr>
-    </w:tbl>
-    <w:p/>
-    <w:p>
-      <w:pPr>
-        <w:pStyle w:val="Heading2"/>
-      </w:pPr>
-      <w:r>
-        <w:t>4. Tab-by-Tab Usage Guide</w:t>
-      </w:r>
-    </w:p>
-    <w:p>
-      <w:pPr>
-        <w:pStyle w:val="Heading3"/>
-      </w:pPr>
-      <w:r>
-        <w:t>4.1  Inventory Tab</w:t>
-      </w:r>
-    </w:p>
-    <w:p>
-      <w:r>
-        <w:t>This is the default landing tab and serves as the daily status dashboard.</w:t>
-      </w:r>
-    </w:p>
-    <w:p>
-      <w:r>
-        <w:rPr>
-          <w:b/>
-        </w:rPr>
-        <w:t>What it shows:</w:t>
-      </w:r>
-    </w:p>
-    <w:p>
-      <w:pPr>
-        <w:pStyle w:val="ListBullet"/>
-      </w:pPr>
-      <w:r>
-        <w:t>A summary row at the top shows total items tracked and counts by status (OK / LOW / CRITICAL). Below that, a table lists every item with columns for Category, Item name, On Hand, Demand, Order Qty, and a color-coded Status badge.</w:t>
-      </w:r>
-    </w:p>
-    <w:p>
-      <w:r>
-        <w:rPr>
-          <w:b/>
-        </w:rPr>
-        <w:t>Status logic:</w:t>
-      </w:r>
-    </w:p>
-    <w:tbl>
-      <w:tblPr>
-        <w:tblStyle w:val="TableGrid"/>
-        <w:tblW w:type="auto" w:w="0"/>
-        <w:tblLook w:firstColumn="1" w:firstRow="1" w:lastColumn="0" w:lastRow="0" w:noHBand="0" w:noVBand="1" w:val="04A0"/>
-      </w:tblPr>
-      <w:tblGrid>
-        <w:gridCol w:w="2928"/>
-        <w:gridCol w:w="2928"/>
-        <w:gridCol w:w="2928"/>
-      </w:tblGrid>
-      <w:tr>
-        <w:tc>
-          <w:tcPr>
-            <w:tcW w:type="dxa" w:w="2928"/>
-            <w:shd w:val="clear" w:color="auto" w:fill="D9E1F2"/>
-          </w:tcPr>
-          <w:p>
-            <w:r/>
-            <w:r>
-              <w:rPr>
-                <w:b/>
-              </w:rPr>
-              <w:t>Status</w:t>
-            </w:r>
-          </w:p>
-        </w:tc>
-        <w:tc>
-          <w:tcPr>
-            <w:tcW w:type="dxa" w:w="2928"/>
-            <w:shd w:val="clear" w:color="auto" w:fill="D9E1F2"/>
-          </w:tcPr>
-          <w:p>
-            <w:r/>
-            <w:r>
-              <w:rPr>
-                <w:b/>
-              </w:rPr>
-              <w:t>Condition</w:t>
-            </w:r>
-          </w:p>
-        </w:tc>
-        <w:tc>
-          <w:tcPr>
-            <w:tcW w:type="dxa" w:w="2928"/>
-            <w:shd w:val="clear" w:color="auto" w:fill="D9E1F2"/>
-          </w:tcPr>
-          <w:p>
-            <w:r/>
-            <w:r>
-              <w:rPr>
-                <w:b/>
-              </w:rPr>
-              <w:t>Badge Color</w:t>
-            </w:r>
-          </w:p>
-        </w:tc>
-      </w:tr>
-      <w:tr>
-        <w:tc>
-          <w:tcPr>
-            <w:tcW w:type="dxa" w:w="2928"/>
-          </w:tcPr>
-          <w:p>
-            <w:r>
-              <w:t>OK</w:t>
-            </w:r>
-          </w:p>
-        </w:tc>
-        <w:tc>
-          <w:tcPr>
-            <w:tcW w:type="dxa" w:w="2928"/>
-          </w:tcPr>
-          <w:p>
-            <w:r>
-              <w:t>On-hand ≥ demand level</w:t>
-            </w:r>
-          </w:p>
-        </w:tc>
-        <w:tc>
-          <w:tcPr>
-            <w:tcW w:type="dxa" w:w="2928"/>
-          </w:tcPr>
-          <w:p>
-            <w:r>
-              <w:t>Green</w:t>
-            </w:r>
-          </w:p>
-        </w:tc>
-      </w:tr>
-      <w:tr>
-        <w:tc>
-          <w:tcPr>
-            <w:tcW w:type="dxa" w:w="2928"/>
-          </w:tcPr>
-          <w:p>
-            <w:r>
-              <w:t>LOW</w:t>
-            </w:r>
-          </w:p>
-        </w:tc>
-        <w:tc>
-          <w:tcPr>
-            <w:tcW w:type="dxa" w:w="2928"/>
-          </w:tcPr>
-          <w:p>
-            <w:r>
-              <w:t>On-hand is 50–99 % of demand level</w:t>
-            </w:r>
-          </w:p>
-        </w:tc>
-        <w:tc>
-          <w:tcPr>
-            <w:tcW w:type="dxa" w:w="2928"/>
-          </w:tcPr>
-          <w:p>
-            <w:r>
-              <w:t>Yellow</w:t>
-            </w:r>
-          </w:p>
-        </w:tc>
-      </w:tr>
-      <w:tr>
-        <w:tc>
-          <w:tcPr>
-            <w:tcW w:type="dxa" w:w="2928"/>
-          </w:tcPr>
-          <w:p>
-            <w:r>
-              <w:t>CRITICAL</w:t>
-            </w:r>
-          </w:p>
-        </w:tc>
-        <w:tc>
-          <w:tcPr>
-            <w:tcW w:type="dxa" w:w="2928"/>
-          </w:tcPr>
-          <w:p>
-            <w:r>
-              <w:t>On-hand is 0, or below 50 % of demand level</w:t>
-            </w:r>
-          </w:p>
-        </w:tc>
-        <w:tc>
-          <w:tcPr>
-            <w:tcW w:type="dxa" w:w="2928"/>
-          </w:tcPr>
-          <w:p>
-            <w:r>
-              <w:t>Red</w:t>
-            </w:r>
-          </w:p>
-        </w:tc>
-      </w:tr>
-    </w:tbl>
-    <w:p/>
-    <w:p>
-      <w:r>
-        <w:rPr>
-          <w:b/>
-        </w:rPr>
-        <w:t xml:space="preserve">Filtering: </w:t>
-      </w:r>
-      <w:r>
-        <w:t>Use the Category and Status dropdowns above the table to narrow the view. Useful for quickly seeing only CRITICAL items before an order cycle.</w:t>
-      </w:r>
-    </w:p>
-    <w:p>
-      <w:r>
-        <w:rPr>
-          <w:b/>
-        </w:rPr>
-        <w:t xml:space="preserve">Refreshing data: </w:t>
-      </w:r>
-      <w:r>
-        <w:t>Data is pulled from Google Sheets at load time. Use the browser refresh button or the reload control in the app to pull the latest sheet values.</w:t>
-      </w:r>
-    </w:p>
-    <w:p>
-      <w:pPr>
-        <w:pStyle w:val="Heading3"/>
-      </w:pPr>
-      <w:r>
-        <w:t>4.2  Order Tab</w:t>
-      </w:r>
-    </w:p>
-    <w:p>
-      <w:r>
-        <w:t>This tab calculates and formats the next supply order based on current inventory gaps.</w:t>
-      </w:r>
-    </w:p>
-    <w:p>
-      <w:r>
-        <w:rPr>
-          <w:b/>
-        </w:rPr>
-        <w:t>Order quantity formula:</w:t>
-      </w:r>
-    </w:p>
-    <w:p>
-      <w:r>
-        <w:rPr>
-          <w:rFonts w:ascii="Courier New" w:hAnsi="Courier New"/>
-        </w:rPr>
-        <w:t xml:space="preserve">    Order Qty = ceil((Demand − On Hand) / 2)</w:t>
-      </w:r>
-    </w:p>
-    <w:p>
-      <w:r>
-        <w:t>This conservative formula orders half the gap, preventing over-ordering.</w:t>
-      </w:r>
-    </w:p>
-    <w:p>
-      <w:r>
-        <w:rPr>
-          <w:b/>
-        </w:rPr>
-        <w:t xml:space="preserve">Reading the order table: </w:t>
-      </w:r>
-      <w:r>
-        <w:t>Each row shows Item name, Priority (Critical / Low / Ok), Quantity, Unit Price, Line Total, and a direct supplier link (Vanguard Mil).</w:t>
-      </w:r>
-    </w:p>
-    <w:p>
-      <w:r>
-        <w:rPr>
-          <w:b/>
-        </w:rPr>
-        <w:t xml:space="preserve">Budget management: </w:t>
-      </w:r>
-      <w:r>
-        <w:t>The current budget is read from cell G3 of the Inventory sheet. The total order cost is displayed and compared against budget. If the order exceeds budget, a visual alert is shown. Click Prioritize to automatically trim the order: items are dropped lowest-priority-first (OK → LOW → CRITICAL) until the total fits within budget.</w:t>
-      </w:r>
-    </w:p>
-    <w:p>
-      <w:r>
-        <w:rPr>
-          <w:b/>
-        </w:rPr>
-        <w:t xml:space="preserve">Exporting the order: </w:t>
-      </w:r>
-      <w:r>
-        <w:t>Click Copy Order to Clipboard to generate a plain-text summary in Vanguard Mil order format. Paste this into an email or the supplier order form.</w:t>
-      </w:r>
-    </w:p>
-    <w:p>
-      <w:pPr>
-        <w:pStyle w:val="Heading3"/>
-      </w:pPr>
-      <w:r>
-        <w:t>4.3  Monitoring Tab</w:t>
-      </w:r>
-    </w:p>
-    <w:p>
-      <w:r>
-        <w:t>This tab manages the lifecycle of a placed order — from submission through shipment arrival to final approval and sheet update.</w:t>
-      </w:r>
-    </w:p>
-    <w:p>
-      <w:r>
-        <w:rPr>
-          <w:b/>
-        </w:rPr>
-        <w:t>Order lifecycle:</w:t>
-      </w:r>
-    </w:p>
-    <w:p>
-      <w:r>
-        <w:rPr>
-          <w:rFonts w:ascii="Courier New" w:hAnsi="Courier New"/>
-        </w:rPr>
-        <w:t xml:space="preserve">    1. PLACED  →  2. ARRIVED  →  3. APPROVED</w:t>
-      </w:r>
-    </w:p>
-    <w:p>
-      <w:pPr>
-        <w:pStyle w:val="ListBullet"/>
-      </w:pPr>
-      <w:r>
-        <w:rPr>
-          <w:b/>
-        </w:rPr>
-        <w:t xml:space="preserve">Step 1 — Place the order: </w:t>
-      </w:r>
-      <w:r>
-        <w:t>After copying the order from the Order tab and submitting it to the supplier, return to the Monitoring tab and click Mark as Placed. This locks in the order details and starts the tracking workflow.</w:t>
-      </w:r>
-    </w:p>
-    <w:p>
-      <w:pPr>
-        <w:pStyle w:val="ListBullet"/>
-      </w:pPr>
-      <w:r>
-        <w:rPr>
-          <w:b/>
-        </w:rPr>
-        <w:t xml:space="preserve">Step 2 — Shipment tracking: </w:t>
-      </w:r>
-      <w:r>
-        <w:t>Enter the tracking number in the Tracking Number field and optionally set an Estimated Delivery Date. The app auto-detects the carrier (UPS, USPS, FedEx, or DHL) from the tracking number format. Click the carrier link to open the live tracking page. Manually update the Shipment Stage as the package progresses: Label Created → In Transit → Out for Delivery → Delivered. A countdown to the estimated delivery date is displayed.</w:t>
-      </w:r>
-    </w:p>
-    <w:p>
-      <w:pPr>
-        <w:pStyle w:val="ListBullet"/>
-      </w:pPr>
-      <w:r>
-        <w:rPr>
-          <w:b/>
-        </w:rPr>
-        <w:t xml:space="preserve">Step 3 — Mark as Arrived: </w:t>
-      </w:r>
-      <w:r>
-        <w:t>When the package arrives, click Mark as Arrived, then use the item checklist to verify each item against the packing list.</w:t>
-      </w:r>
-    </w:p>
-    <w:p>
-      <w:pPr>
-        <w:pStyle w:val="ListBullet"/>
-      </w:pPr>
-      <w:r>
-        <w:rPr>
-          <w:b/>
-        </w:rPr>
-        <w:t xml:space="preserve">Returns: </w:t>
-      </w:r>
-      <w:r>
-        <w:t>If any items need to be returned to the supplier, use the Add Return section to record the item name and quantity.</w:t>
-      </w:r>
-    </w:p>
-    <w:p>
-      <w:pPr>
-        <w:pStyle w:val="ListBullet"/>
-      </w:pPr>
-      <w:r>
-        <w:rPr>
-          <w:b/>
-        </w:rPr>
-        <w:t xml:space="preserve">Step 4 — Approve the order: </w:t>
-      </w:r>
-      <w:r>
-        <w:t>Once the order is both placed and arrived, the Approve Order button becomes active. Clicking it triggers a Google OAuth sign-in prompt — the signed-in account must have edit access to the connected sheet. Upon approval, On-Hand quantities are incremented in the sheet, and a new tab is created recording the full order history. This step is irreversible; do not approve until all items are verified.</w:t>
-      </w:r>
-    </w:p>
-    <w:p>
-      <w:pPr>
-        <w:pStyle w:val="ListBullet"/>
-      </w:pPr>
-      <w:r>
-        <w:rPr>
-          <w:b/>
-        </w:rPr>
-        <w:t xml:space="preserve">Next Order Date: </w:t>
-      </w:r>
-      <w:r>
-        <w:t>The app calculates the second Tuesday of each month as the standard order cycle date and displays a countdown. Use this as a deadline reference when deciding whether to expedite an order.</w:t>
-      </w:r>
-    </w:p>
-    <w:p>
-      <w:pPr>
-        <w:pStyle w:val="Heading3"/>
-      </w:pPr>
-      <w:r>
-        <w:t>4.4  Setup Tab</w:t>
-      </w:r>
-    </w:p>
-    <w:p>
-      <w:r>
-        <w:t>The Setup tab contains a 6-step onboarding guide for connecting a new Google Sheet. This is a one-time configuration performed by the unit administrator:</w:t>
-      </w:r>
-    </w:p>
-    <w:p>
-      <w:pPr>
-        <w:pStyle w:val="ListNumber"/>
-      </w:pPr>
-      <w:r>
-        <w:t>Create a Google Cloud project.</w:t>
-      </w:r>
-    </w:p>
-    <w:p>
-      <w:pPr>
-        <w:pStyle w:val="ListNumber"/>
-      </w:pPr>
-      <w:r>
-        <w:t>Enable the Google Sheets API in that project.</w:t>
-      </w:r>
-    </w:p>
-    <w:p>
-      <w:pPr>
-        <w:pStyle w:val="ListNumber"/>
-      </w:pPr>
-      <w:r>
-        <w:t>Locate the Sheet ID from the Google Sheets URL.</w:t>
-      </w:r>
-    </w:p>
-    <w:p>
-      <w:pPr>
-        <w:pStyle w:val="ListNumber"/>
-      </w:pPr>
-      <w:r>
-        <w:t>Share the sheet publicly (read) or grant the service account access.</w:t>
-      </w:r>
-    </w:p>
-    <w:p>
-      <w:pPr>
-        <w:pStyle w:val="ListNumber"/>
-      </w:pPr>
-      <w:r>
-        <w:t>Paste the Sheet ID into the app's Connect Sheet modal.</w:t>
-      </w:r>
-    </w:p>
-    <w:p>
-      <w:pPr>
-        <w:pStyle w:val="ListNumber"/>
-      </w:pPr>
-      <w:r>
-        <w:t>Ensure the sheet follows the required structure (see Section 5).</w:t>
-      </w:r>
-    </w:p>
-    <w:p>
-      <w:pPr>
-        <w:pStyle w:val="Heading2"/>
-      </w:pPr>
-      <w:r>
-        <w:t>5. Google Sheet Requirements</w:t>
-      </w:r>
-    </w:p>
-    <w:p>
-      <w:r>
-        <w:t>The connected sheet must have a tab named Inventory with the following column layout. Budget is read from cell G3. Data rows span rows 5–200 (row 4 is treated as headers).</w:t>
-      </w:r>
-    </w:p>
-    <w:tbl>
-      <w:tblPr>
-        <w:tblStyle w:val="TableGrid"/>
-        <w:tblW w:type="auto" w:w="0"/>
-        <w:tblLook w:firstColumn="1" w:firstRow="1" w:lastColumn="0" w:lastRow="0" w:noHBand="0" w:noVBand="1" w:val="04A0"/>
-      </w:tblPr>
-      <w:tblGrid>
-        <w:gridCol w:w="2928"/>
-        <w:gridCol w:w="2928"/>
-        <w:gridCol w:w="2928"/>
-      </w:tblGrid>
-      <w:tr>
-        <w:tc>
-          <w:tcPr>
-            <w:tcW w:type="dxa" w:w="2928"/>
-            <w:shd w:val="clear" w:color="auto" w:fill="D9E1F2"/>
-          </w:tcPr>
-          <w:p>
-            <w:r/>
-            <w:r>
-              <w:rPr>
-                <w:b/>
-              </w:rPr>
-              <w:t>Column</w:t>
-            </w:r>
-          </w:p>
-        </w:tc>
-        <w:tc>
-          <w:tcPr>
-            <w:tcW w:type="dxa" w:w="2928"/>
-            <w:shd w:val="clear" w:color="auto" w:fill="D9E1F2"/>
-          </w:tcPr>
-          <w:p>
-            <w:r/>
-            <w:r>
-              <w:rPr>
-                <w:b/>
-              </w:rPr>
-              <w:t>Field</w:t>
-            </w:r>
-          </w:p>
-        </w:tc>
-        <w:tc>
-          <w:tcPr>
-            <w:tcW w:type="dxa" w:w="2928"/>
-            <w:shd w:val="clear" w:color="auto" w:fill="D9E1F2"/>
-          </w:tcPr>
-          <w:p>
-            <w:r/>
-            <w:r>
-              <w:rPr>
-                <w:b/>
-              </w:rPr>
-              <w:t>Notes</w:t>
-            </w:r>
-          </w:p>
-        </w:tc>
-      </w:tr>
-      <w:tr>
-        <w:tc>
-          <w:tcPr>
-            <w:tcW w:type="dxa" w:w="2928"/>
-          </w:tcPr>
-          <w:p>
-            <w:r>
-              <w:t>A</w:t>
-            </w:r>
-          </w:p>
-        </w:tc>
-        <w:tc>
-          <w:tcPr>
-            <w:tcW w:type="dxa" w:w="2928"/>
-          </w:tcPr>
-          <w:p>
-            <w:r>
-              <w:t>Category</w:t>
-            </w:r>
-          </w:p>
-        </w:tc>
-        <w:tc>
-          <w:tcPr>
-            <w:tcW w:type="dxa" w:w="2928"/>
-          </w:tcPr>
-          <w:p>
-            <w:r>
-              <w:t>Item category label</w:t>
-            </w:r>
-          </w:p>
-        </w:tc>
-      </w:tr>
-      <w:tr>
-        <w:tc>
-          <w:tcPr>
-            <w:tcW w:type="dxa" w:w="2928"/>
-          </w:tcPr>
-          <w:p>
-            <w:r>
-              <w:t>B</w:t>
-            </w:r>
-          </w:p>
-        </w:tc>
-        <w:tc>
-          <w:tcPr>
-            <w:tcW w:type="dxa" w:w="2928"/>
-          </w:tcPr>
-          <w:p>
-            <w:r>
-              <w:t>Item</w:t>
-            </w:r>
-          </w:p>
-        </w:tc>
-        <w:tc>
-          <w:tcPr>
-            <w:tcW w:type="dxa" w:w="2928"/>
-          </w:tcPr>
-          <w:p>
-            <w:r>
-              <w:t>Item name</w:t>
-            </w:r>
-          </w:p>
-        </w:tc>
-      </w:tr>
-      <w:tr>
-        <w:tc>
-          <w:tcPr>
-            <w:tcW w:type="dxa" w:w="2928"/>
-          </w:tcPr>
-          <w:p>
-            <w:r>
-              <w:t>C</w:t>
-            </w:r>
-          </w:p>
-        </w:tc>
-        <w:tc>
-          <w:tcPr>
-            <w:tcW w:type="dxa" w:w="2928"/>
-          </w:tcPr>
-          <w:p>
-            <w:r>
-              <w:t>On Hand</w:t>
-            </w:r>
-          </w:p>
-        </w:tc>
-        <w:tc>
-          <w:tcPr>
-            <w:tcW w:type="dxa" w:w="2928"/>
-          </w:tcPr>
-          <w:p>
-            <w:r>
-              <w:t>Current quantity — updated by app on order approval</w:t>
-            </w:r>
-          </w:p>
-        </w:tc>
-      </w:tr>
-      <w:tr>
-        <w:tc>
-          <w:tcPr>
-            <w:tcW w:type="dxa" w:w="2928"/>
-          </w:tcPr>
-          <w:p>
-            <w:r>
-              <w:t>D</w:t>
-            </w:r>
-          </w:p>
-        </w:tc>
-        <w:tc>
-          <w:tcPr>
-            <w:tcW w:type="dxa" w:w="2928"/>
-          </w:tcPr>
-          <w:p>
-            <w:r>
-              <w:t>On Order</w:t>
-            </w:r>
-          </w:p>
-        </w:tc>
-        <w:tc>
-          <w:tcPr>
-            <w:tcW w:type="dxa" w:w="2928"/>
-          </w:tcPr>
-          <w:p>
-            <w:r>
-              <w:t>Quantity currently on order</w:t>
-            </w:r>
-          </w:p>
-        </w:tc>
-      </w:tr>
-      <w:tr>
-        <w:tc>
-          <w:tcPr>
-            <w:tcW w:type="dxa" w:w="2928"/>
-          </w:tcPr>
-          <w:p>
-            <w:r>
-              <w:t>E</w:t>
-            </w:r>
-          </w:p>
-        </w:tc>
-        <w:tc>
-          <w:tcPr>
-            <w:tcW w:type="dxa" w:w="2928"/>
-          </w:tcPr>
-          <w:p>
-            <w:r>
-              <w:t>Demand</w:t>
-            </w:r>
-          </w:p>
-        </w:tc>
-        <w:tc>
-          <w:tcPr>
-            <w:tcW w:type="dxa" w:w="2928"/>
-          </w:tcPr>
-          <w:p>
-            <w:r>
-              <w:t>Target/minimum stock level</w:t>
-            </w:r>
-          </w:p>
-        </w:tc>
-      </w:tr>
-      <w:tr>
-        <w:tc>
-          <w:tcPr>
-            <w:tcW w:type="dxa" w:w="2928"/>
-          </w:tcPr>
-          <w:p>
-            <w:r>
-              <w:t>H</w:t>
-            </w:r>
-          </w:p>
-        </w:tc>
-        <w:tc>
-          <w:tcPr>
-            <w:tcW w:type="dxa" w:w="2928"/>
-          </w:tcPr>
-          <w:p>
-            <w:r>
-              <w:t>Price</w:t>
-            </w:r>
-          </w:p>
-        </w:tc>
-        <w:tc>
-          <w:tcPr>
-            <w:tcW w:type="dxa" w:w="2928"/>
-          </w:tcPr>
-          <w:p>
-            <w:r>
-              <w:t>Unit price in dollars</w:t>
-            </w:r>
-          </w:p>
-        </w:tc>
-      </w:tr>
-      <w:tr>
-        <w:tc>
-          <w:tcPr>
-            <w:tcW w:type="dxa" w:w="2928"/>
-          </w:tcPr>
-          <w:p>
-            <w:r>
-              <w:t>J</w:t>
-            </w:r>
-          </w:p>
-        </w:tc>
-        <w:tc>
-          <w:tcPr>
-            <w:tcW w:type="dxa" w:w="2928"/>
-          </w:tcPr>
-          <w:p>
-            <w:r>
-              <w:t>Link</w:t>
-            </w:r>
-          </w:p>
-        </w:tc>
-        <w:tc>
-          <w:tcPr>
-            <w:tcW w:type="dxa" w:w="2928"/>
-          </w:tcPr>
-          <w:p>
-            <w:r>
-              <w:t>Supplier URL</w:t>
-            </w:r>
-          </w:p>
-        </w:tc>
-      </w:tr>
-    </w:tbl>
-    <w:p/>
-    <w:p>
-      <w:pPr>
-        <w:pStyle w:val="Heading2"/>
-      </w:pPr>
-      <w:r>
-        <w:t>6. Admin Features</w:t>
-      </w:r>
-    </w:p>
-    <w:p>
-      <w:pPr>
-        <w:pStyle w:val="Heading3"/>
-      </w:pPr>
-      <w:r>
-        <w:t>Demand Editor (Password Protected)</w:t>
-      </w:r>
-    </w:p>
-    <w:p>
-      <w:r>
-        <w:t>The Demand Editor allows an administrator to override demand levels stored in the sheet with local, device-specific values — useful for temporary adjustments without modifying the master sheet. Access it via the settings icon in the header. Overrides are stored in browser localStorage and do not sync across users or devices.</w:t>
-      </w:r>
-    </w:p>
-    <w:p>
-      <w:pPr>
-        <w:pStyle w:val="Heading3"/>
-      </w:pPr>
-      <w:r>
-        <w:t>Demo Mode</w:t>
-      </w:r>
-    </w:p>
-    <w:p>
-      <w:r>
-        <w:t>If no Google Sheet is connected, the app loads a pre-built sample dataset for demonstration and training purposes. Useful for onboarding new users without risking real data.</w:t>
-      </w:r>
-    </w:p>
-    <w:p>
-      <w:pPr>
-        <w:pStyle w:val="Heading2"/>
-      </w:pPr>
-      <w:r>
-        <w:t>7. Data Persistence Summary</w:t>
-      </w:r>
-    </w:p>
-    <w:tbl>
-      <w:tblPr>
-        <w:tblStyle w:val="TableGrid"/>
-        <w:tblW w:type="auto" w:w="0"/>
-        <w:tblLook w:firstColumn="1" w:firstRow="1" w:lastColumn="0" w:lastRow="0" w:noHBand="0" w:noVBand="1" w:val="04A0"/>
-      </w:tblPr>
-      <w:tblGrid>
-        <w:gridCol w:w="2928"/>
-        <w:gridCol w:w="2928"/>
-        <w:gridCol w:w="2928"/>
-      </w:tblGrid>
-      <w:tr>
-        <w:tc>
-          <w:tcPr>
-            <w:tcW w:type="dxa" w:w="2928"/>
-            <w:shd w:val="clear" w:color="auto" w:fill="D9E1F2"/>
-          </w:tcPr>
-          <w:p>
-            <w:r/>
-            <w:r>
-              <w:rPr>
-                <w:b/>
-              </w:rPr>
-              <w:t>Data</w:t>
-            </w:r>
-          </w:p>
-        </w:tc>
-        <w:tc>
-          <w:tcPr>
-            <w:tcW w:type="dxa" w:w="2928"/>
-            <w:shd w:val="clear" w:color="auto" w:fill="D9E1F2"/>
-          </w:tcPr>
-          <w:p>
-            <w:r/>
-            <w:r>
-              <w:rPr>
-                <w:b/>
-              </w:rPr>
-              <w:t>Storage Location</w:t>
-            </w:r>
-          </w:p>
-        </w:tc>
-        <w:tc>
-          <w:tcPr>
-            <w:tcW w:type="dxa" w:w="2928"/>
-            <w:shd w:val="clear" w:color="auto" w:fill="D9E1F2"/>
-          </w:tcPr>
-          <w:p>
-            <w:r/>
-            <w:r>
-              <w:rPr>
-                <w:b/>
-              </w:rPr>
-              <w:t>Scope</w:t>
-            </w:r>
-          </w:p>
-        </w:tc>
-      </w:tr>
-      <w:tr>
-        <w:tc>
-          <w:tcPr>
-            <w:tcW w:type="dxa" w:w="2928"/>
-          </w:tcPr>
-          <w:p>
-            <w:r>
-              <w:t>Inventory &amp; budget</w:t>
-            </w:r>
-          </w:p>
-        </w:tc>
-        <w:tc>
-          <w:tcPr>
-            <w:tcW w:type="dxa" w:w="2928"/>
-          </w:tcPr>
-          <w:p>
-            <w:r>
-              <w:t>Google Sheet (remote)</w:t>
-            </w:r>
-          </w:p>
-        </w:tc>
-        <w:tc>
-          <w:tcPr>
-            <w:tcW w:type="dxa" w:w="2928"/>
-          </w:tcPr>
-          <w:p>
-            <w:r>
-              <w:t>All users</w:t>
-            </w:r>
-          </w:p>
-        </w:tc>
-      </w:tr>
-      <w:tr>
-        <w:tc>
-          <w:tcPr>
-            <w:tcW w:type="dxa" w:w="2928"/>
-          </w:tcPr>
-          <w:p>
-            <w:r>
-              <w:t>Sheet ID</w:t>
-            </w:r>
-          </w:p>
-        </w:tc>
-        <w:tc>
-          <w:tcPr>
-            <w:tcW w:type="dxa" w:w="2928"/>
-          </w:tcPr>
-          <w:p>
-            <w:r>
-              <w:t>Browser localStorage</w:t>
-            </w:r>
-          </w:p>
-        </w:tc>
-        <w:tc>
-          <w:tcPr>
-            <w:tcW w:type="dxa" w:w="2928"/>
-          </w:tcPr>
-          <w:p>
-            <w:r>
-              <w:t>Device only</w:t>
-            </w:r>
-          </w:p>
-        </w:tc>
-      </w:tr>
-      <w:tr>
-        <w:tc>
-          <w:tcPr>
-            <w:tcW w:type="dxa" w:w="2928"/>
-          </w:tcPr>
-          <w:p>
-            <w:r>
-              <w:t>Active order state</w:t>
-            </w:r>
-          </w:p>
-        </w:tc>
-        <w:tc>
-          <w:tcPr>
-            <w:tcW w:type="dxa" w:w="2928"/>
-          </w:tcPr>
-          <w:p>
-            <w:r>
-              <w:t>Browser localStorage</w:t>
-            </w:r>
-          </w:p>
-        </w:tc>
-        <w:tc>
-          <w:tcPr>
-            <w:tcW w:type="dxa" w:w="2928"/>
-          </w:tcPr>
-          <w:p>
-            <w:r>
-              <w:t>Device only</w:t>
-            </w:r>
-          </w:p>
-        </w:tc>
-      </w:tr>
-      <w:tr>
-        <w:tc>
-          <w:tcPr>
-            <w:tcW w:type="dxa" w:w="2928"/>
-          </w:tcPr>
-          <w:p>
-            <w:r>
-              <w:t>Demand overrides</w:t>
-            </w:r>
-          </w:p>
-        </w:tc>
-        <w:tc>
-          <w:tcPr>
-            <w:tcW w:type="dxa" w:w="2928"/>
-          </w:tcPr>
-          <w:p>
-            <w:r>
-              <w:t>Browser localStorage</w:t>
-            </w:r>
-          </w:p>
-        </w:tc>
-        <w:tc>
-          <w:tcPr>
-            <w:tcW w:type="dxa" w:w="2928"/>
-          </w:tcPr>
-          <w:p>
-            <w:r>
-              <w:t>Device only</w:t>
-            </w:r>
-          </w:p>
-        </w:tc>
-      </w:tr>
-      <w:tr>
-        <w:tc>
-          <w:tcPr>
-            <w:tcW w:type="dxa" w:w="2928"/>
-          </w:tcPr>
-          <w:p>
-            <w:r>
-              <w:t>Approved order records</w:t>
-            </w:r>
-          </w:p>
-        </w:tc>
-        <w:tc>
-          <w:tcPr>
-            <w:tcW w:type="dxa" w:w="2928"/>
-          </w:tcPr>
-          <w:p>
-            <w:r>
-              <w:t>Google Sheet (new tab)</w:t>
-            </w:r>
-          </w:p>
-        </w:tc>
-        <w:tc>
-          <w:tcPr>
-            <w:tcW w:type="dxa" w:w="2928"/>
-          </w:tcPr>
-          <w:p>
-            <w:r>
-              <w:t>All users</w:t>
-            </w:r>
-          </w:p>
-        </w:tc>
-      </w:tr>
-      <w:tr>
-        <w:tc>
-          <w:tcPr>
-            <w:tcW w:type="dxa" w:w="2928"/>
-          </w:tcPr>
-          <w:p>
-            <w:r>
-              <w:t>OAuth token</w:t>
-            </w:r>
-          </w:p>
-        </w:tc>
-        <w:tc>
-          <w:tcPr>
-            <w:tcW w:type="dxa" w:w="2928"/>
-          </w:tcPr>
-          <w:p>
-            <w:r>
-              <w:t>Browser session memory</w:t>
-            </w:r>
-          </w:p>
-        </w:tc>
-        <w:tc>
-          <w:tcPr>
-            <w:tcW w:type="dxa" w:w="2928"/>
-          </w:tcPr>
-          <w:p>
-            <w:r>
-              <w:t>Session only</w:t>
-            </w:r>
-          </w:p>
-        </w:tc>
-      </w:tr>
-    </w:tbl>
-    <w:p/>
-    <w:p>
-      <w:pPr>
-        <w:pStyle w:val="Heading2"/>
-      </w:pPr>
-      <w:r>
-        <w:t>8. Standard Operating Procedure — Monthly Order Cycle</w:t>
-      </w:r>
-    </w:p>
-    <w:p>
-      <w:r>
-        <w:t>The following sequence is recommended for each monthly order cycle:</w:t>
-      </w:r>
-    </w:p>
-    <w:p>
-      <w:pPr>
-        <w:pStyle w:val="ListNumber"/>
-      </w:pPr>
-      <w:r>
-        <w:rPr>
-          <w:b/>
-        </w:rPr>
-        <w:t xml:space="preserve">Before the order date: </w:t>
-      </w:r>
-      <w:r>
-        <w:t>Open the Inventory tab. Filter by CRITICAL and LOW to confirm which items need replenishment.</w:t>
-      </w:r>
-    </w:p>
-    <w:p>
-      <w:pPr>
-        <w:pStyle w:val="ListNumber"/>
-      </w:pPr>
-      <w:r>
-        <w:rPr>
-          <w:b/>
-        </w:rPr>
-        <w:t xml:space="preserve">Review the order: </w:t>
-      </w:r>
-      <w:r>
-        <w:t>Switch to the Order tab. Confirm quantities and verify total cost is within budget. Use Prioritize if needed.</w:t>
-      </w:r>
-    </w:p>
-    <w:p>
-      <w:pPr>
-        <w:pStyle w:val="ListNumber"/>
-      </w:pPr>
-      <w:r>
-        <w:rPr>
-          <w:b/>
-        </w:rPr>
-        <w:t xml:space="preserve">Export and submit: </w:t>
-      </w:r>
-      <w:r>
-        <w:t>Copy the order to clipboard. Submit to Vanguard Mil or other supplier.</w:t>
-      </w:r>
-    </w:p>
-    <w:p>
-      <w:pPr>
-        <w:pStyle w:val="ListNumber"/>
-      </w:pPr>
-      <w:r>
-        <w:rPr>
-          <w:b/>
-        </w:rPr>
-        <w:t xml:space="preserve">Log the placement: </w:t>
-      </w:r>
-      <w:r>
-        <w:t>Go to the Monitoring tab and click Mark as Placed.</w:t>
-      </w:r>
-    </w:p>
-    <w:p>
-      <w:pPr>
-        <w:pStyle w:val="ListNumber"/>
-      </w:pPr>
-      <w:r>
-        <w:rPr>
-          <w:b/>
-        </w:rPr>
-        <w:t xml:space="preserve">Enter tracking info: </w:t>
-      </w:r>
-      <w:r>
-        <w:t>When the supplier provides a tracking number, enter it in the Monitoring tab and set an estimated delivery date.</w:t>
-      </w:r>
-    </w:p>
-    <w:p>
-      <w:pPr>
-        <w:pStyle w:val="ListNumber"/>
-      </w:pPr>
-      <w:r>
-        <w:rPr>
-          <w:b/>
-        </w:rPr>
-        <w:t xml:space="preserve">Receive the shipment: </w:t>
-      </w:r>
-      <w:r>
-        <w:t>When the package arrives, click Mark as Arrived and verify each item against the checklist.</w:t>
-      </w:r>
-    </w:p>
-    <w:p>
-      <w:pPr>
-        <w:pStyle w:val="ListNumber"/>
-      </w:pPr>
-      <w:r>
-        <w:rPr>
-          <w:b/>
-        </w:rPr>
-        <w:t xml:space="preserve">Approve the order: </w:t>
-      </w:r>
-      <w:r>
-        <w:t>With all items verified, click Approve Order, sign in with a Google account that has sheet edit access, and confirm. The sheet updates automatically.</w:t>
-      </w:r>
-    </w:p>
-    <w:p>
-      <w:pPr>
-        <w:pStyle w:val="Heading2"/>
-      </w:pPr>
-      <w:r>
-        <w:t>9. Troubleshooting</w:t>
-      </w:r>
-    </w:p>
-    <w:tbl>
-      <w:tblPr>
-        <w:tblStyle w:val="TableGrid"/>
-        <w:tblW w:type="auto" w:w="0"/>
-        <w:tblLook w:firstColumn="1" w:firstRow="1" w:lastColumn="0" w:lastRow="0" w:noHBand="0" w:noVBand="1" w:val="04A0"/>
-      </w:tblPr>
-      <w:tblGrid>
-        <w:gridCol w:w="2928"/>
-        <w:gridCol w:w="2928"/>
-        <w:gridCol w:w="2928"/>
-      </w:tblGrid>
-      <w:tr>
-        <w:tc>
-          <w:tcPr>
-            <w:tcW w:type="dxa" w:w="2928"/>
-            <w:shd w:val="clear" w:color="auto" w:fill="D9E1F2"/>
-          </w:tcPr>
-          <w:p>
-            <w:r/>
-            <w:r>
-              <w:rPr>
-                <w:b/>
-              </w:rPr>
-              <w:t>Symptom</w:t>
-            </w:r>
-          </w:p>
-        </w:tc>
-        <w:tc>
-          <w:tcPr>
-            <w:tcW w:type="dxa" w:w="2928"/>
-            <w:shd w:val="clear" w:color="auto" w:fill="D9E1F2"/>
-          </w:tcPr>
-          <w:p>
-            <w:r/>
-            <w:r>
-              <w:rPr>
-                <w:b/>
-              </w:rPr>
-              <w:t>Likely Cause</w:t>
-            </w:r>
-          </w:p>
-        </w:tc>
-        <w:tc>
-          <w:tcPr>
-            <w:tcW w:type="dxa" w:w="2928"/>
-            <w:shd w:val="clear" w:color="auto" w:fill="D9E1F2"/>
-          </w:tcPr>
-          <w:p>
-            <w:r/>
-            <w:r>
-              <w:rPr>
-                <w:b/>
-              </w:rPr>
-              <w:t>Resolution</w:t>
-            </w:r>
-          </w:p>
-        </w:tc>
-      </w:tr>
-      <w:tr>
-        <w:tc>
-          <w:tcPr>
-            <w:tcW w:type="dxa" w:w="2928"/>
-          </w:tcPr>
-          <w:p>
-            <w:r>
-              <w:t>Blank inventory table</w:t>
-            </w:r>
-          </w:p>
-        </w:tc>
-        <w:tc>
-          <w:tcPr>
-            <w:tcW w:type="dxa" w:w="2928"/>
-          </w:tcPr>
-          <w:p>
-            <w:r>
-              <w:t>Sheet not connected or incorrect Sheet ID</w:t>
-            </w:r>
-          </w:p>
-        </w:tc>
-        <w:tc>
-          <w:tcPr>
-            <w:tcW w:type="dxa" w:w="2928"/>
-          </w:tcPr>
-          <w:p>
-            <w:r>
-              <w:t>Go to Setup tab and re-enter the Sheet ID</w:t>
-            </w:r>
-          </w:p>
-        </w:tc>
-      </w:tr>
-      <w:tr>
-        <w:tc>
-          <w:tcPr>
-            <w:tcW w:type="dxa" w:w="2928"/>
-          </w:tcPr>
-          <w:p>
-            <w:r>
-              <w:t>"Budget exceeded" alert on Order tab</w:t>
-            </w:r>
-          </w:p>
-        </w:tc>
-        <w:tc>
-          <w:tcPr>
-            <w:tcW w:type="dxa" w:w="2928"/>
-          </w:tcPr>
-          <w:p>
-            <w:r>
-              <w:t>Order total &gt; G3 budget value</w:t>
-            </w:r>
-          </w:p>
-        </w:tc>
-        <w:tc>
-          <w:tcPr>
-            <w:tcW w:type="dxa" w:w="2928"/>
-          </w:tcPr>
-          <w:p>
-            <w:r>
-              <w:t>Click Prioritize or manually remove low-priority items; or update G3 in the sheet</w:t>
-            </w:r>
-          </w:p>
-        </w:tc>
-      </w:tr>
-      <w:tr>
-        <w:tc>
-          <w:tcPr>
-            <w:tcW w:type="dxa" w:w="2928"/>
-          </w:tcPr>
-          <w:p>
-            <w:r>
-              <w:t>Approve button greyed out</w:t>
-            </w:r>
-          </w:p>
-        </w:tc>
-        <w:tc>
-          <w:tcPr>
-            <w:tcW w:type="dxa" w:w="2928"/>
-          </w:tcPr>
-          <w:p>
-            <w:r>
-              <w:t>Order not yet marked Placed and Arrived</w:t>
-            </w:r>
-          </w:p>
-        </w:tc>
-        <w:tc>
-          <w:tcPr>
-            <w:tcW w:type="dxa" w:w="2928"/>
-          </w:tcPr>
-          <w:p>
-            <w:r>
-              <w:t>Complete both steps before approving</w:t>
-            </w:r>
-          </w:p>
-        </w:tc>
-      </w:tr>
-      <w:tr>
-        <w:tc>
-          <w:tcPr>
-            <w:tcW w:type="dxa" w:w="2928"/>
-          </w:tcPr>
-          <w:p>
-            <w:r>
-              <w:t>Carrier not detected</w:t>
-            </w:r>
-          </w:p>
-        </w:tc>
-        <w:tc>
-          <w:tcPr>
-            <w:tcW w:type="dxa" w:w="2928"/>
-          </w:tcPr>
-          <w:p>
-            <w:r>
-              <w:t>Tracking number format not recognized</w:t>
-            </w:r>
-          </w:p>
-        </w:tc>
-        <w:tc>
-          <w:tcPr>
-            <w:tcW w:type="dxa" w:w="2928"/>
-          </w:tcPr>
-          <w:p>
-            <w:r>
-              <w:t>Manually select the carrier from the dropdown</w:t>
-            </w:r>
-          </w:p>
-        </w:tc>
-      </w:tr>
-      <w:tr>
-        <w:tc>
-          <w:tcPr>
-            <w:tcW w:type="dxa" w:w="2928"/>
-          </w:tcPr>
-          <w:p>
-            <w:r>
-              <w:t>Demand overrides not applying</w:t>
-            </w:r>
-          </w:p>
-        </w:tc>
-        <w:tc>
-          <w:tcPr>
-            <w:tcW w:type="dxa" w:w="2928"/>
-          </w:tcPr>
-          <w:p>
-            <w:r>
-              <w:t>Overrides stored on a different device</w:t>
-            </w:r>
-          </w:p>
-        </w:tc>
-        <w:tc>
-          <w:tcPr>
-            <w:tcW w:type="dxa" w:w="2928"/>
-          </w:tcPr>
-          <w:p>
-            <w:r>
-              <w:t>Re-enter overrides on the current device via the Demand Editor</w:t>
-            </w:r>
-          </w:p>
-        </w:tc>
-      </w:tr>
-      <w:tr>
-        <w:tc>
-          <w:tcPr>
-            <w:tcW w:type="dxa" w:w="2928"/>
-          </w:tcPr>
-          <w:p>
-            <w:r>
-              <w:t>OAuth sign-in fails on approval</w:t>
-            </w:r>
-          </w:p>
-        </w:tc>
-        <w:tc>
-          <w:tcPr>
-            <w:tcW w:type="dxa" w:w="2928"/>
-          </w:tcPr>
-          <w:p>
-            <w:r>
-              <w:t>Google account lacks edit access to sheet</w:t>
-            </w:r>
-          </w:p>
-        </w:tc>
-        <w:tc>
-          <w:tcPr>
-            <w:tcW w:type="dxa" w:w="2928"/>
-          </w:tcPr>
-          <w:p>
-            <w:r>
-              <w:t>Share the sheet with the relevant Google account as an Editor</w:t>
-            </w:r>
-          </w:p>
-        </w:tc>
-      </w:tr>
-      <w:tr>
-        <w:tc>
-          <w:tcPr>
-            <w:tcW w:type="dxa" w:w="2928"/>
-          </w:tcPr>
-          <w:p>
-            <w:r>
-              <w:t>App shows demo data unexpectedly</w:t>
-            </w:r>
-          </w:p>
-        </w:tc>
-        <w:tc>
-          <w:tcPr>
-            <w:tcW w:type="dxa" w:w="2928"/>
-          </w:tcPr>
-          <w:p>
-            <w:r>
-              <w:t>No Sheet ID stored in browser</w:t>
-            </w:r>
-          </w:p>
-        </w:tc>
-        <w:tc>
-          <w:tcPr>
-            <w:tcW w:type="dxa" w:w="2928"/>
-          </w:tcPr>
-          <w:p>
-            <w:r>
-              <w:t>Click Connect Sheet and enter the correct Sheet ID</w:t>
-            </w:r>
-          </w:p>
-        </w:tc>
-      </w:tr>
-    </w:tbl>
-    <w:p/>
-    <w:p>
-      <w:pPr>
-        <w:pStyle w:val="Heading2"/>
-      </w:pPr>
-      <w:r>
-        <w:t>10. Quick Reference — Key Sheet Cells</w:t>
+        <w:t>This is the home screen. It shows the current stock status of every item the squadron carries.</w:t>
       </w:r>
     </w:p>
     <w:tbl>
@@ -1815,7 +104,7 @@
               <w:rPr>
                 <w:b/>
               </w:rPr>
-              <w:t>Cell / Range</w:t>
+              <w:t>Badge</w:t>
             </w:r>
           </w:p>
         </w:tc>
@@ -1830,7 +119,7 @@
               <w:rPr>
                 <w:b/>
               </w:rPr>
-              <w:t>Purpose</w:t>
+              <w:t>Meaning</w:t>
             </w:r>
           </w:p>
         </w:tc>
@@ -1841,12 +130,8 @@
             <w:tcW w:type="dxa" w:w="4392"/>
           </w:tcPr>
           <w:p>
-            <w:r/>
             <w:r>
-              <w:rPr>
-                <w:rFonts w:ascii="Courier New" w:hAnsi="Courier New"/>
-              </w:rPr>
-              <w:t>Inventory!G3</w:t>
+              <w:t>OK</w:t>
             </w:r>
           </w:p>
         </w:tc>
@@ -1855,9 +140,8 @@
             <w:tcW w:type="dxa" w:w="4392"/>
           </w:tcPr>
           <w:p>
-            <w:r/>
             <w:r>
-              <w:t>Budget for current order cycle</w:t>
+              <w:t>On-hand quantity meets or exceeds the demand level</w:t>
             </w:r>
           </w:p>
         </w:tc>
@@ -1868,12 +152,8 @@
             <w:tcW w:type="dxa" w:w="4392"/>
           </w:tcPr>
           <w:p>
-            <w:r/>
             <w:r>
-              <w:rPr>
-                <w:rFonts w:ascii="Courier New" w:hAnsi="Courier New"/>
-              </w:rPr>
-              <w:t>Inventory!A5:J200</w:t>
+              <w:t>LOW</w:t>
             </w:r>
           </w:p>
         </w:tc>
@@ -1882,9 +162,8 @@
             <w:tcW w:type="dxa" w:w="4392"/>
           </w:tcPr>
           <w:p>
-            <w:r/>
             <w:r>
-              <w:t>All inventory item data</w:t>
+              <w:t>On-hand is between 50–99% of the demand level</w:t>
             </w:r>
           </w:p>
         </w:tc>
@@ -1895,12 +174,8 @@
             <w:tcW w:type="dxa" w:w="4392"/>
           </w:tcPr>
           <w:p>
-            <w:r/>
             <w:r>
-              <w:rPr>
-                <w:rFonts w:ascii="Courier New" w:hAnsi="Courier New"/>
-              </w:rPr>
-              <w:t>Inventory!C* (Column C)</w:t>
+              <w:t>CRITICAL</w:t>
             </w:r>
           </w:p>
         </w:tc>
@@ -1909,9 +184,8 @@
             <w:tcW w:type="dxa" w:w="4392"/>
           </w:tcPr>
           <w:p>
-            <w:r/>
             <w:r>
-              <w:t>On-Hand quantities — updated by app on order approval</w:t>
+              <w:t>On-hand is zero, or below 50% of the demand level</w:t>
             </w:r>
           </w:p>
         </w:tc>
@@ -1919,19 +193,570 @@
     </w:tbl>
     <w:p/>
     <w:p>
+      <w:r>
+        <w:rPr>
+          <w:b/>
+        </w:rPr>
+        <w:t xml:space="preserve">Filters: </w:t>
+      </w:r>
+      <w:r>
+        <w:t>Use the Category and Status dropdowns to narrow the list — e.g., show only CRITICAL items before placing an order.</w:t>
+      </w:r>
+    </w:p>
+    <w:p>
+      <w:r>
+        <w:rPr>
+          <w:b/>
+        </w:rPr>
+        <w:t xml:space="preserve">Summary cards: </w:t>
+      </w:r>
+      <w:r>
+        <w:t>Shown at the top — totals for OK, LOW, and CRITICAL items at a glance.</w:t>
+      </w:r>
+    </w:p>
+    <w:p>
+      <w:r>
+        <w:rPr>
+          <w:b/>
+        </w:rPr>
+        <w:t xml:space="preserve">Refreshing: </w:t>
+      </w:r>
+      <w:r>
+        <w:t>Click the ↺ REFRESH button in the header to pull the latest data from the sheet.</w:t>
+      </w:r>
+    </w:p>
+    <w:p>
+      <w:pPr>
+        <w:pStyle w:val="Heading2"/>
+      </w:pPr>
+      <w:r>
+        <w:t>Updating On-Hand Quantities</w:t>
+      </w:r>
+    </w:p>
+    <w:p>
+      <w:r>
+        <w:t>On-hand quantities are not typed in directly. They change in three ways:</w:t>
+      </w:r>
+    </w:p>
+    <w:p>
+      <w:pPr>
+        <w:pStyle w:val="Heading3"/>
+      </w:pPr>
+      <w:r>
+        <w:t>1. Via the Loans Tab (immediate)</w:t>
+      </w:r>
+    </w:p>
+    <w:p>
+      <w:r>
+        <w:t>Logging a loan immediately reduces the on-hand count. Returning a loan immediately restores it.</w:t>
+      </w:r>
+    </w:p>
+    <w:p>
+      <w:pPr>
+        <w:pStyle w:val="Heading3"/>
+      </w:pPr>
+      <w:r>
+        <w:t>2. Via Order Approval (end of each order cycle)</w:t>
+      </w:r>
+    </w:p>
+    <w:p>
+      <w:r>
+        <w:t>When you approve a completed order in the Monitoring tab, the app writes the received quantities back to the Google Sheet, increasing on-hand counts automatically.</w:t>
+      </w:r>
+    </w:p>
+    <w:p>
+      <w:pPr>
+        <w:pStyle w:val="Heading3"/>
+      </w:pPr>
+      <w:r>
+        <w:t>3. Direct sheet edit (outside the app)</w:t>
+      </w:r>
+    </w:p>
+    <w:p>
+      <w:r>
+        <w:t>If a manual correction is needed, open the connected Google Sheet and edit the On Hand column (Column C) directly. Click ↺ REFRESH in the app to see the updated values.</w:t>
+      </w:r>
+    </w:p>
+    <w:p>
+      <w:pPr>
+        <w:pStyle w:val="Heading2"/>
+      </w:pPr>
+      <w:r>
+        <w:t>Loans Tab</w:t>
+      </w:r>
+    </w:p>
+    <w:p>
+      <w:r>
+        <w:t>Use this tab to track items loaned out to members and return them when they come back.</w:t>
+      </w:r>
+    </w:p>
+    <w:p>
+      <w:pPr>
+        <w:pStyle w:val="Heading3"/>
+      </w:pPr>
+      <w:r>
+        <w:t>Logging a Loan</w:t>
+      </w:r>
+    </w:p>
+    <w:p>
+      <w:pPr>
+        <w:pStyle w:val="ListNumber"/>
+      </w:pPr>
+      <w:r>
+        <w:t>Select the item from the dropdown.</w:t>
+      </w:r>
+    </w:p>
+    <w:p>
+      <w:pPr>
+        <w:pStyle w:val="ListNumber"/>
+      </w:pPr>
+      <w:r>
+        <w:t>Enter the borrower's name.</w:t>
+      </w:r>
+    </w:p>
+    <w:p>
+      <w:pPr>
+        <w:pStyle w:val="ListNumber"/>
+      </w:pPr>
+      <w:r>
+        <w:t>Enter the quantity being loaned.</w:t>
+      </w:r>
+    </w:p>
+    <w:p>
+      <w:pPr>
+        <w:pStyle w:val="ListNumber"/>
+      </w:pPr>
+      <w:r>
+        <w:t>The date auto-fills to today — adjust if needed.</w:t>
+      </w:r>
+    </w:p>
+    <w:p>
+      <w:pPr>
+        <w:pStyle w:val="ListNumber"/>
+      </w:pPr>
+      <w:r>
+        <w:t>Click + LOG LOAN.</w:t>
+      </w:r>
+    </w:p>
+    <w:p>
+      <w:r>
+        <w:t>The on-hand count for that item drops immediately in the app and syncs to the sheet.</w:t>
+      </w:r>
+    </w:p>
+    <w:p>
+      <w:pPr>
+        <w:pStyle w:val="Heading3"/>
+      </w:pPr>
+      <w:r>
+        <w:t>Returning a Loan</w:t>
+      </w:r>
+    </w:p>
+    <w:p>
+      <w:pPr>
+        <w:pStyle w:val="ListNumber"/>
+      </w:pPr>
+      <w:r>
+        <w:t>Find the loan in the Active Loans list.</w:t>
+      </w:r>
+    </w:p>
+    <w:p>
+      <w:pPr>
+        <w:pStyle w:val="ListNumber"/>
+      </w:pPr>
+      <w:r>
+        <w:t>Click the green ✓ RETURN button next to it.</w:t>
+      </w:r>
+    </w:p>
+    <w:p>
+      <w:r>
+        <w:t>The on-hand count is restored immediately.</w:t>
+      </w:r>
+    </w:p>
+    <w:p>
+      <w:pPr>
+        <w:pStyle w:val="Heading3"/>
+      </w:pPr>
+      <w:r>
+        <w:t>Loan History</w:t>
+      </w:r>
+    </w:p>
+    <w:p>
+      <w:r>
+        <w:t>Returned loans move to the history section, shown in grey with the return date for record-keeping.</w:t>
+      </w:r>
+    </w:p>
+    <w:p>
+      <w:r>
+        <w:rPr>
+          <w:b/>
+        </w:rPr>
+        <w:t xml:space="preserve">Note on ordering: </w:t>
+      </w:r>
+      <w:r>
+        <w:t>Loaned quantities count against on-hand when the app calculates how much to order. If 10 items are on-hand but 3 are on loan, the app treats effective stock as 7.</w:t>
+      </w:r>
+    </w:p>
+    <w:p>
+      <w:pPr>
+        <w:pStyle w:val="Heading2"/>
+      </w:pPr>
+      <w:r>
+        <w:t>Order Generator Tab</w:t>
+      </w:r>
+    </w:p>
+    <w:p>
+      <w:r>
+        <w:t>This tab builds the monthly supply order based on what is low or critical.</w:t>
+      </w:r>
+    </w:p>
+    <w:p>
+      <w:pPr>
+        <w:pStyle w:val="Heading3"/>
+      </w:pPr>
+      <w:r>
+        <w:t>Reading the Order</w:t>
+      </w:r>
+    </w:p>
+    <w:p>
+      <w:r>
+        <w:t>Each row shows the item, its priority (Critical / Low / OK), the suggested order quantity, unit price, line total, and a direct link to the item on the supplier's website.</w:t>
+      </w:r>
+    </w:p>
+    <w:p>
+      <w:r>
+        <w:rPr>
+          <w:b/>
+        </w:rPr>
+        <w:t xml:space="preserve">Order quantity formula: </w:t>
+      </w:r>
+      <w:r>
+        <w:t>The app orders half the gap between current on-hand and demand, rounded up. This keeps orders conservative.</w:t>
+      </w:r>
+    </w:p>
+    <w:p>
+      <w:pPr>
+        <w:pStyle w:val="Heading3"/>
+      </w:pPr>
+      <w:r>
+        <w:t>Budget</w:t>
+      </w:r>
+    </w:p>
+    <w:p>
+      <w:r>
+        <w:t>The current budget is shown at the top alongside the total order cost. If the order exceeds budget, a warning appears. Click PRIORITIZE to automatically trim the order — it drops OK items first, then LOW items, until the total fits within budget.</w:t>
+      </w:r>
+    </w:p>
+    <w:p>
+      <w:pPr>
+        <w:pStyle w:val="Heading3"/>
+      </w:pPr>
+      <w:r>
+        <w:t>Locking and Exporting</w:t>
+      </w:r>
+    </w:p>
+    <w:p>
+      <w:pPr>
+        <w:pStyle w:val="ListBullet"/>
+      </w:pPr>
+      <w:r>
+        <w:t>⎘ COPY ORDER — copies the order summary to the clipboard. Paste it into an email or the supplier's order form.</w:t>
+      </w:r>
+    </w:p>
+    <w:p>
+      <w:pPr>
+        <w:pStyle w:val="ListBullet"/>
+      </w:pPr>
+      <w:r>
+        <w:t>◆ LOCK IN ORDER — snapshots the order and moves it to the Monitoring tab for shipment tracking.</w:t>
+      </w:r>
+    </w:p>
+    <w:p>
+      <w:pPr>
+        <w:pStyle w:val="Heading2"/>
+      </w:pPr>
+      <w:r>
+        <w:t>Monitoring Tab</w:t>
+      </w:r>
+    </w:p>
+    <w:p>
+      <w:r>
+        <w:t>This tab tracks a locked order from placement through delivery and final approval.</w:t>
+      </w:r>
+    </w:p>
+    <w:p>
+      <w:pPr>
+        <w:pStyle w:val="Heading3"/>
+      </w:pPr>
+      <w:r>
+        <w:t>Order Stages</w:t>
+      </w:r>
+    </w:p>
+    <w:p>
+      <w:r>
+        <w:rPr>
+          <w:rFonts w:ascii="Courier New" w:hAnsi="Courier New"/>
+          <w:sz w:val="20"/>
+        </w:rPr>
+        <w:t xml:space="preserve">    PLACED  →  ARRIVED  →  APPROVED</w:t>
+      </w:r>
+    </w:p>
+    <w:p/>
+    <w:p>
+      <w:pPr>
+        <w:pStyle w:val="ListBullet"/>
+      </w:pPr>
+      <w:r>
+        <w:rPr>
+          <w:b/>
+        </w:rPr>
+        <w:t xml:space="preserve">Mark as Placed — </w:t>
+      </w:r>
+      <w:r>
+        <w:t>after submitting the order to the supplier, click this to record that the order is in.</w:t>
+      </w:r>
+    </w:p>
+    <w:p>
+      <w:pPr>
+        <w:pStyle w:val="ListBullet"/>
+      </w:pPr>
+      <w:r>
+        <w:rPr>
+          <w:b/>
+        </w:rPr>
+        <w:t xml:space="preserve">Shipment Tracking — </w:t>
+      </w:r>
+      <w:r>
+        <w:t>enter the tracking number once the supplier provides it. The app auto-detects the carrier (UPS, USPS, FedEx, DHL) and shows a link to the carrier's tracking page. Set an estimated delivery date to see a countdown. Manually advance the shipment stage as updates come in: Label Created → In Transit → Out for Delivery → Delivered.</w:t>
+      </w:r>
+    </w:p>
+    <w:p>
+      <w:pPr>
+        <w:pStyle w:val="ListBullet"/>
+      </w:pPr>
+      <w:r>
+        <w:rPr>
+          <w:b/>
+        </w:rPr>
+        <w:t xml:space="preserve">Mark as Arrived — </w:t>
+      </w:r>
+      <w:r>
+        <w:t>when the package arrives, click this, then work through the item checklist to verify everything against the packing list.</w:t>
+      </w:r>
+    </w:p>
+    <w:p>
+      <w:pPr>
+        <w:pStyle w:val="ListBullet"/>
+      </w:pPr>
+      <w:r>
+        <w:rPr>
+          <w:b/>
+        </w:rPr>
+        <w:t xml:space="preserve">Returns — </w:t>
+      </w:r>
+      <w:r>
+        <w:t>if any items need to go back to the supplier, use Add Return to log the item and quantity.</w:t>
+      </w:r>
+    </w:p>
+    <w:p>
+      <w:pPr>
+        <w:pStyle w:val="ListBullet"/>
+      </w:pPr>
+      <w:r>
+        <w:rPr>
+          <w:b/>
+        </w:rPr>
+        <w:t xml:space="preserve">Approve Order — </w:t>
+      </w:r>
+      <w:r>
+        <w:t>once the order is marked both Placed and Arrived, the Approve button becomes active. Clicking it writes the received quantities to the On Hand column in the sheet and creates a permanent order record tab. This action cannot be undone — only approve once everything is verified.</w:t>
+      </w:r>
+    </w:p>
+    <w:p>
+      <w:pPr>
+        <w:pStyle w:val="Heading3"/>
+      </w:pPr>
+      <w:r>
+        <w:t>Next Order Date</w:t>
+      </w:r>
+    </w:p>
+    <w:p>
+      <w:r>
+        <w:t>The app shows a countdown to the second Tuesday of each month — the standard order cycle date. Use this to gauge urgency.</w:t>
+      </w:r>
+    </w:p>
+    <w:p>
+      <w:pPr>
+        <w:pStyle w:val="Heading2"/>
+      </w:pPr>
+      <w:r>
+        <w:t>Demand Editor (Admin)</w:t>
+      </w:r>
+    </w:p>
+    <w:p>
+      <w:r>
+        <w:t>The Demand Editor lets an administrator temporarily override demand levels used for status and order calculations, without changing the master sheet.</w:t>
+      </w:r>
+    </w:p>
+    <w:p>
+      <w:r>
+        <w:rPr>
+          <w:b/>
+        </w:rPr>
+        <w:t xml:space="preserve">To access: </w:t>
+      </w:r>
+      <w:r>
+        <w:t>Click the EDIT DEMAND button on the Inventory tab and enter the admin password.</w:t>
+      </w:r>
+    </w:p>
+    <w:p>
+      <w:r>
+        <w:t>Each item shows its sheet default alongside a local override field. Edit the values and click Save. Overrides are stored on the current device only — they do not sync to other users.</w:t>
+      </w:r>
+    </w:p>
+    <w:p>
+      <w:r>
+        <w:t>To clear all overrides, click Reset to Sheet Defaults.</w:t>
+      </w:r>
+    </w:p>
+    <w:p>
+      <w:r>
+        <w:t>To permanently change a demand level for everyone, edit Column E in the Google Sheet directly, then refresh the app.</w:t>
+      </w:r>
+    </w:p>
+    <w:p>
+      <w:pPr>
+        <w:pStyle w:val="Heading2"/>
+      </w:pPr>
+      <w:r>
+        <w:t>Monthly Workflow — Quick Reference</w:t>
+      </w:r>
+    </w:p>
+    <w:p>
+      <w:pPr>
+        <w:pStyle w:val="ListNumber"/>
+      </w:pPr>
+      <w:r>
+        <w:rPr>
+          <w:b/>
+        </w:rPr>
+        <w:t xml:space="preserve">Check inventory — </w:t>
+      </w:r>
+      <w:r>
+        <w:t>Inventory tab, filter by CRITICAL and LOW.</w:t>
+      </w:r>
+    </w:p>
+    <w:p>
+      <w:pPr>
+        <w:pStyle w:val="ListNumber"/>
+      </w:pPr>
+      <w:r>
+        <w:rPr>
+          <w:b/>
+        </w:rPr>
+        <w:t xml:space="preserve">Review the order — </w:t>
+      </w:r>
+      <w:r>
+        <w:t>Order Generator tab, confirm quantities and budget.</w:t>
+      </w:r>
+    </w:p>
+    <w:p>
+      <w:pPr>
+        <w:pStyle w:val="ListNumber"/>
+      </w:pPr>
+      <w:r>
+        <w:rPr>
+          <w:b/>
+        </w:rPr>
+        <w:t xml:space="preserve">Copy and submit — </w:t>
+      </w:r>
+      <w:r>
+        <w:t>Copy order to clipboard, submit to supplier.</w:t>
+      </w:r>
+    </w:p>
+    <w:p>
+      <w:pPr>
+        <w:pStyle w:val="ListNumber"/>
+      </w:pPr>
+      <w:r>
+        <w:rPr>
+          <w:b/>
+        </w:rPr>
+        <w:t xml:space="preserve">Lock the order — </w:t>
+      </w:r>
+      <w:r>
+        <w:t>Click Lock In Order to move it to Monitoring.</w:t>
+      </w:r>
+    </w:p>
+    <w:p>
+      <w:pPr>
+        <w:pStyle w:val="ListNumber"/>
+      </w:pPr>
+      <w:r>
+        <w:rPr>
+          <w:b/>
+        </w:rPr>
+        <w:t xml:space="preserve">Mark as placed — </w:t>
+      </w:r>
+      <w:r>
+        <w:t>Monitoring tab → Mark as Placed.</w:t>
+      </w:r>
+    </w:p>
+    <w:p>
+      <w:pPr>
+        <w:pStyle w:val="ListNumber"/>
+      </w:pPr>
+      <w:r>
+        <w:rPr>
+          <w:b/>
+        </w:rPr>
+        <w:t xml:space="preserve">Enter tracking — </w:t>
+      </w:r>
+      <w:r>
+        <w:t>Add tracking number and estimated delivery date.</w:t>
+      </w:r>
+    </w:p>
+    <w:p>
+      <w:pPr>
+        <w:pStyle w:val="ListNumber"/>
+      </w:pPr>
+      <w:r>
+        <w:rPr>
+          <w:b/>
+        </w:rPr>
+        <w:t xml:space="preserve">Receive shipment — </w:t>
+      </w:r>
+      <w:r>
+        <w:t>Mark as Arrived, tick off items on the checklist.</w:t>
+      </w:r>
+    </w:p>
+    <w:p>
+      <w:pPr>
+        <w:pStyle w:val="ListNumber"/>
+      </w:pPr>
+      <w:r>
+        <w:rPr>
+          <w:b/>
+        </w:rPr>
+        <w:t xml:space="preserve">Approve — </w:t>
+      </w:r>
+      <w:r>
+        <w:t>Click Approve Order once everything is verified. On-hand updates automatically.</w:t>
+      </w:r>
+    </w:p>
+    <w:p>
       <w:pPr>
         <w:pBdr>
-          <w:bottom w:val="single" w:sz="6" w:space="1" w:color="999999"/>
+          <w:bottom w:val="single" w:sz="6" w:space="1" w:color="AAAAAA"/>
         </w:pBdr>
       </w:pPr>
     </w:p>
     <w:p>
       <w:r>
         <w:rPr>
-          <w:color w:val="888888"/>
+          <w:color w:val="999999"/>
           <w:sz w:val="18"/>
         </w:rPr>
-        <w:t>Report prepared using direct analysis of the application source code. All procedures reflect application behavior as of the current build.</w:t>
+        <w:t>All procedures reflect application behavior as of the current build.</w:t>
       </w:r>
     </w:p>
     <w:sectPr>

</xml_diff>

<commit_message>
Update usage report for Excel export feature
Replaces copy-to-clipboard references with Export Order (.xlsx)
instructions, adds a table of the exported file's columns, and
includes a 5-step guide for opening the download in Google Sheets.

https://claude.ai/code/session_011fwVFzxjse3LdyLjxSezh3
</commit_message>
<xml_diff>
--- a/USAGE_REPORT.docx
+++ b/USAGE_REPORT.docx
@@ -451,7 +451,253 @@
         <w:pStyle w:val="Heading3"/>
       </w:pPr>
       <w:r>
-        <w:t>Locking and Exporting</w:t>
+        <w:t>Exporting the Order</w:t>
+      </w:r>
+    </w:p>
+    <w:p>
+      <w:r>
+        <w:t>Click ⬇ EXPORT ORDER to download an Excel file named overlake-order-YYYY-MM-DD.xlsx.</w:t>
+      </w:r>
+    </w:p>
+    <w:tbl>
+      <w:tblPr>
+        <w:tblStyle w:val="TableGrid"/>
+        <w:tblW w:type="auto" w:w="0"/>
+        <w:tblLook w:firstColumn="1" w:firstRow="1" w:lastColumn="0" w:lastRow="0" w:noHBand="0" w:noVBand="1" w:val="04A0"/>
+      </w:tblPr>
+      <w:tblGrid>
+        <w:gridCol w:w="4392"/>
+        <w:gridCol w:w="4392"/>
+      </w:tblGrid>
+      <w:tr>
+        <w:tc>
+          <w:tcPr>
+            <w:tcW w:type="dxa" w:w="4392"/>
+            <w:shd w:val="clear" w:color="auto" w:fill="D9E1F2"/>
+          </w:tcPr>
+          <w:p>
+            <w:r/>
+            <w:r>
+              <w:rPr>
+                <w:b/>
+              </w:rPr>
+              <w:t>Column</w:t>
+            </w:r>
+          </w:p>
+        </w:tc>
+        <w:tc>
+          <w:tcPr>
+            <w:tcW w:type="dxa" w:w="4392"/>
+            <w:shd w:val="clear" w:color="auto" w:fill="D9E1F2"/>
+          </w:tcPr>
+          <w:p>
+            <w:r/>
+            <w:r>
+              <w:rPr>
+                <w:b/>
+              </w:rPr>
+              <w:t>Contents</w:t>
+            </w:r>
+          </w:p>
+        </w:tc>
+      </w:tr>
+      <w:tr>
+        <w:tc>
+          <w:tcPr>
+            <w:tcW w:type="dxa" w:w="4392"/>
+          </w:tcPr>
+          <w:p>
+            <w:r>
+              <w:t>Item Name</w:t>
+            </w:r>
+          </w:p>
+        </w:tc>
+        <w:tc>
+          <w:tcPr>
+            <w:tcW w:type="dxa" w:w="4392"/>
+          </w:tcPr>
+          <w:p>
+            <w:r>
+              <w:t>Name of the item</w:t>
+            </w:r>
+          </w:p>
+        </w:tc>
+      </w:tr>
+      <w:tr>
+        <w:tc>
+          <w:tcPr>
+            <w:tcW w:type="dxa" w:w="4392"/>
+          </w:tcPr>
+          <w:p>
+            <w:r>
+              <w:t>Priority</w:t>
+            </w:r>
+          </w:p>
+        </w:tc>
+        <w:tc>
+          <w:tcPr>
+            <w:tcW w:type="dxa" w:w="4392"/>
+          </w:tcPr>
+          <w:p>
+            <w:r>
+              <w:t>CRITICAL, LOW, or OK</w:t>
+            </w:r>
+          </w:p>
+        </w:tc>
+      </w:tr>
+      <w:tr>
+        <w:tc>
+          <w:tcPr>
+            <w:tcW w:type="dxa" w:w="4392"/>
+          </w:tcPr>
+          <w:p>
+            <w:r>
+              <w:t>Qty</w:t>
+            </w:r>
+          </w:p>
+        </w:tc>
+        <w:tc>
+          <w:tcPr>
+            <w:tcW w:type="dxa" w:w="4392"/>
+          </w:tcPr>
+          <w:p>
+            <w:r>
+              <w:t>Suggested order quantity</w:t>
+            </w:r>
+          </w:p>
+        </w:tc>
+      </w:tr>
+      <w:tr>
+        <w:tc>
+          <w:tcPr>
+            <w:tcW w:type="dxa" w:w="4392"/>
+          </w:tcPr>
+          <w:p>
+            <w:r>
+              <w:t>Price/ea</w:t>
+            </w:r>
+          </w:p>
+        </w:tc>
+        <w:tc>
+          <w:tcPr>
+            <w:tcW w:type="dxa" w:w="4392"/>
+          </w:tcPr>
+          <w:p>
+            <w:r>
+              <w:t>Unit price</w:t>
+            </w:r>
+          </w:p>
+        </w:tc>
+      </w:tr>
+      <w:tr>
+        <w:tc>
+          <w:tcPr>
+            <w:tcW w:type="dxa" w:w="4392"/>
+          </w:tcPr>
+          <w:p>
+            <w:r>
+              <w:t>Line Total</w:t>
+            </w:r>
+          </w:p>
+        </w:tc>
+        <w:tc>
+          <w:tcPr>
+            <w:tcW w:type="dxa" w:w="4392"/>
+          </w:tcPr>
+          <w:p>
+            <w:r>
+              <w:t>Qty × unit price</w:t>
+            </w:r>
+          </w:p>
+        </w:tc>
+      </w:tr>
+      <w:tr>
+        <w:tc>
+          <w:tcPr>
+            <w:tcW w:type="dxa" w:w="4392"/>
+          </w:tcPr>
+          <w:p>
+            <w:r>
+              <w:t>Link</w:t>
+            </w:r>
+          </w:p>
+        </w:tc>
+        <w:tc>
+          <w:tcPr>
+            <w:tcW w:type="dxa" w:w="4392"/>
+          </w:tcPr>
+          <w:p>
+            <w:r>
+              <w:t>Supplier URL for that item</w:t>
+            </w:r>
+          </w:p>
+        </w:tc>
+      </w:tr>
+    </w:tbl>
+    <w:p>
+      <w:r>
+        <w:t>A summary block at the bottom of the file shows Order Total, Budget, and Remaining.</w:t>
+      </w:r>
+    </w:p>
+    <w:p>
+      <w:pPr>
+        <w:pStyle w:val="Heading3"/>
+      </w:pPr>
+      <w:r>
+        <w:t>Opening the Export in Google Sheets</w:t>
+      </w:r>
+    </w:p>
+    <w:p>
+      <w:r>
+        <w:t>After downloading the file, follow these steps to open it in Google Sheets:</w:t>
+      </w:r>
+    </w:p>
+    <w:p>
+      <w:pPr>
+        <w:pStyle w:val="ListNumber"/>
+      </w:pPr>
+      <w:r>
+        <w:t>Go to sheets.google.com and sign in.</w:t>
+      </w:r>
+    </w:p>
+    <w:p>
+      <w:pPr>
+        <w:pStyle w:val="ListNumber"/>
+      </w:pPr>
+      <w:r>
+        <w:t>Click Blank spreadsheet to open a new sheet, then go to File → Import.</w:t>
+      </w:r>
+    </w:p>
+    <w:p>
+      <w:pPr>
+        <w:pStyle w:val="ListNumber"/>
+      </w:pPr>
+      <w:r>
+        <w:t>Select the Upload tab and drag the downloaded .xlsx file in, or click Browse to locate it.</w:t>
+      </w:r>
+    </w:p>
+    <w:p>
+      <w:pPr>
+        <w:pStyle w:val="ListNumber"/>
+      </w:pPr>
+      <w:r>
+        <w:t>Under Import location choose Replace spreadsheet, then click Import data.</w:t>
+      </w:r>
+    </w:p>
+    <w:p>
+      <w:pPr>
+        <w:pStyle w:val="ListNumber"/>
+      </w:pPr>
+      <w:r>
+        <w:t>The order opens as a fully editable Google Sheet — add notes, share it with others, or print it from there.</w:t>
+      </w:r>
+    </w:p>
+    <w:p>
+      <w:pPr>
+        <w:pStyle w:val="Heading3"/>
+      </w:pPr>
+      <w:r>
+        <w:t>Locking the Order</w:t>
       </w:r>
     </w:p>
     <w:p>
@@ -459,15 +705,13 @@
         <w:pStyle w:val="ListBullet"/>
       </w:pPr>
       <w:r>
-        <w:t>⎘ COPY ORDER — copies the order summary to the clipboard. Paste it into an email or the supplier's order form.</w:t>
+        <w:rPr>
+          <w:b/>
+        </w:rPr>
+        <w:t xml:space="preserve">◆ LOCK IN ORDER — </w:t>
       </w:r>
-    </w:p>
-    <w:p>
-      <w:pPr>
-        <w:pStyle w:val="ListBullet"/>
-      </w:pPr>
       <w:r>
-        <w:t>◆ LOCK IN ORDER — snapshots the order and moves it to the Monitoring tab for shipment tracking.</w:t>
+        <w:t>snapshots the order and moves it to the Monitoring tab for shipment tracking.</w:t>
       </w:r>
     </w:p>
     <w:p>
@@ -667,10 +911,10 @@
         <w:rPr>
           <w:b/>
         </w:rPr>
-        <w:t xml:space="preserve">Copy and submit — </w:t>
+        <w:t xml:space="preserve">Export and submit — </w:t>
       </w:r>
       <w:r>
-        <w:t>Copy order to clipboard, submit to supplier.</w:t>
+        <w:t>Click ⬇ Export Order to download the .xlsx file, then submit to supplier.</w:t>
       </w:r>
     </w:p>
     <w:p>

</xml_diff>

<commit_message>
Simplify usage report: URL only, no technical jargon
- Opens with cap-logistics.vercel.app — no setup/connect-sheet/npm
- Removed Setup tab references (sheet is hardcoded)
- Removed localhost, API key, Sheet ID, and Google Cloud mentions
- Regenerated USAGE_REPORT.docx to match

https://claude.ai/code/session_011fwVFzxjse3LdyLjxSezh3
</commit_message>
<xml_diff>
--- a/USAGE_REPORT.docx
+++ b/USAGE_REPORT.docx
@@ -56,17 +56,35 @@
         <w:pStyle w:val="Heading2"/>
       </w:pPr>
       <w:r>
+        <w:t>Accessing the App</w:t>
+      </w:r>
+    </w:p>
+    <w:p>
+      <w:r>
+        <w:t xml:space="preserve">Open </w:t>
+      </w:r>
+      <w:r>
+        <w:rPr>
+          <w:b/>
+          <w:color w:val="1A3A6B"/>
+        </w:rPr>
+        <w:t>cap-logistics.vercel.app</w:t>
+      </w:r>
+      <w:r>
+        <w:t xml:space="preserve"> in any web browser. No login, no installation, and no setup required — the app loads immediately with the squadron's live inventory data.</w:t>
+      </w:r>
+    </w:p>
+    <w:p>
+      <w:pPr>
+        <w:pStyle w:val="Heading2"/>
+      </w:pPr>
+      <w:r>
         <w:t>Overview</w:t>
       </w:r>
     </w:p>
     <w:p>
       <w:r>
-        <w:t>The Overlake CAP Logistics Manager is a web app for tracking squadron inventory, logging loans, generating monthly supply orders, and receiving shipments. It reads inventory data from the squadron's shared Google Sheet and writes back to it when orders are approved or loans are recorded.</w:t>
-      </w:r>
-    </w:p>
-    <w:p>
-      <w:r>
-        <w:t>There are five tabs: Inventory, Loans, Order Generator, Monitoring, and Setup.</w:t>
+        <w:t>The app has four tabs across the top: Inventory, Loans, Order Generator, and Monitoring. Use the ↺ REFRESH button in the header at any time to pull the latest data.</w:t>
       </w:r>
     </w:p>
     <w:p>
@@ -79,7 +97,7 @@
     </w:p>
     <w:p>
       <w:r>
-        <w:t>This is the home screen. It shows the current stock status of every item the squadron carries.</w:t>
+        <w:t>The home screen. Shows the current stock status of every item the squadron carries.</w:t>
       </w:r>
     </w:p>
     <w:tbl>
@@ -197,17 +215,6 @@
         <w:rPr>
           <w:b/>
         </w:rPr>
-        <w:t xml:space="preserve">Filters: </w:t>
-      </w:r>
-      <w:r>
-        <w:t>Use the Category and Status dropdowns to narrow the list — e.g., show only CRITICAL items before placing an order.</w:t>
-      </w:r>
-    </w:p>
-    <w:p>
-      <w:r>
-        <w:rPr>
-          <w:b/>
-        </w:rPr>
         <w:t xml:space="preserve">Summary cards: </w:t>
       </w:r>
       <w:r>
@@ -219,10 +226,10 @@
         <w:rPr>
           <w:b/>
         </w:rPr>
-        <w:t xml:space="preserve">Refreshing: </w:t>
+        <w:t xml:space="preserve">Filters: </w:t>
       </w:r>
       <w:r>
-        <w:t>Click the ↺ REFRESH button in the header to pull the latest data from the sheet.</w:t>
+        <w:t>Use the Category and Status dropdowns to narrow the list — e.g., show only CRITICAL items before placing an order.</w:t>
       </w:r>
     </w:p>
     <w:p>
@@ -235,46 +242,49 @@
     </w:p>
     <w:p>
       <w:r>
-        <w:t>On-hand quantities are not typed in directly. They change in three ways:</w:t>
+        <w:t>On-hand quantities are not entered directly in the app. They change in three ways:</w:t>
       </w:r>
     </w:p>
     <w:p>
       <w:pPr>
-        <w:pStyle w:val="Heading3"/>
+        <w:pStyle w:val="ListNumber"/>
       </w:pPr>
       <w:r>
-        <w:t>1. Via the Loans Tab (immediate)</w:t>
+        <w:rPr>
+          <w:b/>
+        </w:rPr>
+        <w:t xml:space="preserve">Logging a loan </w:t>
       </w:r>
-    </w:p>
-    <w:p>
       <w:r>
-        <w:t>Logging a loan immediately reduces the on-hand count. Returning a loan immediately restores it.</w:t>
+        <w:t>immediately reduces the on-hand count. Returning it restores it.</w:t>
       </w:r>
     </w:p>
     <w:p>
       <w:pPr>
-        <w:pStyle w:val="Heading3"/>
+        <w:pStyle w:val="ListNumber"/>
       </w:pPr>
       <w:r>
-        <w:t>2. Via Order Approval (end of each order cycle)</w:t>
+        <w:rPr>
+          <w:b/>
+        </w:rPr>
+        <w:t xml:space="preserve">Approving a completed order </w:t>
       </w:r>
-    </w:p>
-    <w:p>
       <w:r>
-        <w:t>When you approve a completed order in the Monitoring tab, the app writes the received quantities back to the Google Sheet, increasing on-hand counts automatically.</w:t>
+        <w:t>in the Monitoring tab writes received quantities back, increasing on-hand counts.</w:t>
       </w:r>
     </w:p>
     <w:p>
       <w:pPr>
-        <w:pStyle w:val="Heading3"/>
+        <w:pStyle w:val="ListNumber"/>
       </w:pPr>
       <w:r>
-        <w:t>3. Direct sheet edit (outside the app)</w:t>
+        <w:rPr>
+          <w:b/>
+        </w:rPr>
+        <w:t xml:space="preserve">Editing the Google Sheet directly </w:t>
       </w:r>
-    </w:p>
-    <w:p>
       <w:r>
-        <w:t>If a manual correction is needed, open the connected Google Sheet and edit the On Hand column (Column C) directly. Click ↺ REFRESH in the app to see the updated values.</w:t>
+        <w:t>— change the On Hand column (Column C) in the inventory sheet, then hit ↺ REFRESH in the app.</w:t>
       </w:r>
     </w:p>
     <w:p>
@@ -287,7 +297,7 @@
     </w:p>
     <w:p>
       <w:r>
-        <w:t>Use this tab to track items loaned out to members and return them when they come back.</w:t>
+        <w:t>Tracks items loaned out to members.</w:t>
       </w:r>
     </w:p>
     <w:p>
@@ -319,7 +329,7 @@
         <w:pStyle w:val="ListNumber"/>
       </w:pPr>
       <w:r>
-        <w:t>Enter the quantity being loaned.</w:t>
+        <w:t>Enter the quantity — whole numbers only (e.g. 2, not 1.5).</w:t>
       </w:r>
     </w:p>
     <w:p>
@@ -340,7 +350,7 @@
     </w:p>
     <w:p>
       <w:r>
-        <w:t>The on-hand count for that item drops immediately in the app and syncs to the sheet.</w:t>
+        <w:t>The on-hand count drops immediately and syncs to the sheet.</w:t>
       </w:r>
     </w:p>
     <w:p>
@@ -364,25 +374,12 @@
         <w:pStyle w:val="ListNumber"/>
       </w:pPr>
       <w:r>
-        <w:t>Click the green ✓ RETURN button next to it.</w:t>
+        <w:t>Click ✓ RETURN next to it.</w:t>
       </w:r>
     </w:p>
     <w:p>
       <w:r>
-        <w:t>The on-hand count is restored immediately.</w:t>
-      </w:r>
-    </w:p>
-    <w:p>
-      <w:pPr>
-        <w:pStyle w:val="Heading3"/>
-      </w:pPr>
-      <w:r>
-        <w:t>Loan History</w:t>
-      </w:r>
-    </w:p>
-    <w:p>
-      <w:r>
-        <w:t>Returned loans move to the history section, shown in grey with the return date for record-keeping.</w:t>
+        <w:t>The on-hand count is restored immediately. Returned loans move to the history section below.</w:t>
       </w:r>
     </w:p>
     <w:p>
@@ -390,10 +387,10 @@
         <w:rPr>
           <w:b/>
         </w:rPr>
-        <w:t xml:space="preserve">Note on ordering: </w:t>
+        <w:t xml:space="preserve">Note: </w:t>
       </w:r>
       <w:r>
-        <w:t>Loaned quantities count against on-hand when the app calculates how much to order. If 10 items are on-hand but 3 are on loan, the app treats effective stock as 7.</w:t>
+        <w:t>Loaned quantities count against on-hand when calculating what needs to be ordered. If 10 items are on-hand but 3 are on loan, the app treats effective stock as 7.</w:t>
       </w:r>
     </w:p>
     <w:p>
@@ -406,7 +403,7 @@
     </w:p>
     <w:p>
       <w:r>
-        <w:t>This tab builds the monthly supply order based on what is low or critical.</w:t>
+        <w:t>Builds the monthly supply order based on what is low or critical.</w:t>
       </w:r>
     </w:p>
     <w:p>
@@ -419,18 +416,7 @@
     </w:p>
     <w:p>
       <w:r>
-        <w:t>Each row shows the item, its priority (Critical / Low / OK), the suggested order quantity, unit price, line total, and a direct link to the item on the supplier's website.</w:t>
-      </w:r>
-    </w:p>
-    <w:p>
-      <w:r>
-        <w:rPr>
-          <w:b/>
-        </w:rPr>
-        <w:t xml:space="preserve">Order quantity formula: </w:t>
-      </w:r>
-      <w:r>
-        <w:t>The app orders half the gap between current on-hand and demand, rounded up. This keeps orders conservative.</w:t>
+        <w:t>Each row shows the item, its priority (Critical / Low / OK), suggested order quantity, unit price, line total, and a direct link to the item on the supplier's website. The app orders half the gap between current on-hand and demand, rounded up — keeping orders conservative.</w:t>
       </w:r>
     </w:p>
     <w:p>
@@ -443,7 +429,7 @@
     </w:p>
     <w:p>
       <w:r>
-        <w:t>The current budget is shown at the top alongside the total order cost. If the order exceeds budget, a warning appears. Click PRIORITIZE to automatically trim the order — it drops OK items first, then LOW items, until the total fits within budget.</w:t>
+        <w:t>The current budget and total order cost are shown at the top. If the order exceeds budget a warning appears — click PRIORITIZE to automatically trim the order, dropping OK items first then LOW items until it fits. Prioritized mode clears itself automatically if changes bring the order back within budget.</w:t>
       </w:r>
     </w:p>
     <w:p>
@@ -456,200 +442,26 @@
     </w:p>
     <w:p>
       <w:r>
-        <w:t>Click ⬇ EXPORT ORDER to download an Excel file named overlake-order-YYYY-MM-DD.xlsx.</w:t>
+        <w:rPr>
+          <w:b/>
+        </w:rPr>
+        <w:t xml:space="preserve">⬇ EXPORT ORDER </w:t>
+      </w:r>
+      <w:r>
+        <w:t>— downloads overlake-order-YYYY-MM-DD.xlsx.</w:t>
       </w:r>
     </w:p>
-    <w:tbl>
-      <w:tblPr>
-        <w:tblStyle w:val="TableGrid"/>
-        <w:tblW w:type="auto" w:w="0"/>
-        <w:tblLook w:firstColumn="1" w:firstRow="1" w:lastColumn="0" w:lastRow="0" w:noHBand="0" w:noVBand="1" w:val="04A0"/>
-      </w:tblPr>
-      <w:tblGrid>
-        <w:gridCol w:w="4392"/>
-        <w:gridCol w:w="4392"/>
-      </w:tblGrid>
-      <w:tr>
-        <w:tc>
-          <w:tcPr>
-            <w:tcW w:type="dxa" w:w="4392"/>
-            <w:shd w:val="clear" w:color="auto" w:fill="D9E1F2"/>
-          </w:tcPr>
-          <w:p>
-            <w:r/>
-            <w:r>
-              <w:rPr>
-                <w:b/>
-              </w:rPr>
-              <w:t>Column</w:t>
-            </w:r>
-          </w:p>
-        </w:tc>
-        <w:tc>
-          <w:tcPr>
-            <w:tcW w:type="dxa" w:w="4392"/>
-            <w:shd w:val="clear" w:color="auto" w:fill="D9E1F2"/>
-          </w:tcPr>
-          <w:p>
-            <w:r/>
-            <w:r>
-              <w:rPr>
-                <w:b/>
-              </w:rPr>
-              <w:t>Contents</w:t>
-            </w:r>
-          </w:p>
-        </w:tc>
-      </w:tr>
-      <w:tr>
-        <w:tc>
-          <w:tcPr>
-            <w:tcW w:type="dxa" w:w="4392"/>
-          </w:tcPr>
-          <w:p>
-            <w:r>
-              <w:t>Item Name</w:t>
-            </w:r>
-          </w:p>
-        </w:tc>
-        <w:tc>
-          <w:tcPr>
-            <w:tcW w:type="dxa" w:w="4392"/>
-          </w:tcPr>
-          <w:p>
-            <w:r>
-              <w:t>Name of the item</w:t>
-            </w:r>
-          </w:p>
-        </w:tc>
-      </w:tr>
-      <w:tr>
-        <w:tc>
-          <w:tcPr>
-            <w:tcW w:type="dxa" w:w="4392"/>
-          </w:tcPr>
-          <w:p>
-            <w:r>
-              <w:t>Priority</w:t>
-            </w:r>
-          </w:p>
-        </w:tc>
-        <w:tc>
-          <w:tcPr>
-            <w:tcW w:type="dxa" w:w="4392"/>
-          </w:tcPr>
-          <w:p>
-            <w:r>
-              <w:t>CRITICAL, LOW, or OK</w:t>
-            </w:r>
-          </w:p>
-        </w:tc>
-      </w:tr>
-      <w:tr>
-        <w:tc>
-          <w:tcPr>
-            <w:tcW w:type="dxa" w:w="4392"/>
-          </w:tcPr>
-          <w:p>
-            <w:r>
-              <w:t>Qty</w:t>
-            </w:r>
-          </w:p>
-        </w:tc>
-        <w:tc>
-          <w:tcPr>
-            <w:tcW w:type="dxa" w:w="4392"/>
-          </w:tcPr>
-          <w:p>
-            <w:r>
-              <w:t>Suggested order quantity</w:t>
-            </w:r>
-          </w:p>
-        </w:tc>
-      </w:tr>
-      <w:tr>
-        <w:tc>
-          <w:tcPr>
-            <w:tcW w:type="dxa" w:w="4392"/>
-          </w:tcPr>
-          <w:p>
-            <w:r>
-              <w:t>Price/ea</w:t>
-            </w:r>
-          </w:p>
-        </w:tc>
-        <w:tc>
-          <w:tcPr>
-            <w:tcW w:type="dxa" w:w="4392"/>
-          </w:tcPr>
-          <w:p>
-            <w:r>
-              <w:t>Unit price</w:t>
-            </w:r>
-          </w:p>
-        </w:tc>
-      </w:tr>
-      <w:tr>
-        <w:tc>
-          <w:tcPr>
-            <w:tcW w:type="dxa" w:w="4392"/>
-          </w:tcPr>
-          <w:p>
-            <w:r>
-              <w:t>Line Total</w:t>
-            </w:r>
-          </w:p>
-        </w:tc>
-        <w:tc>
-          <w:tcPr>
-            <w:tcW w:type="dxa" w:w="4392"/>
-          </w:tcPr>
-          <w:p>
-            <w:r>
-              <w:t>Qty × unit price</w:t>
-            </w:r>
-          </w:p>
-        </w:tc>
-      </w:tr>
-      <w:tr>
-        <w:tc>
-          <w:tcPr>
-            <w:tcW w:type="dxa" w:w="4392"/>
-          </w:tcPr>
-          <w:p>
-            <w:r>
-              <w:t>Link</w:t>
-            </w:r>
-          </w:p>
-        </w:tc>
-        <w:tc>
-          <w:tcPr>
-            <w:tcW w:type="dxa" w:w="4392"/>
-          </w:tcPr>
-          <w:p>
-            <w:r>
-              <w:t>Supplier URL for that item</w:t>
-            </w:r>
-          </w:p>
-        </w:tc>
-      </w:tr>
-    </w:tbl>
     <w:p>
       <w:r>
-        <w:t>A summary block at the bottom of the file shows Order Total, Budget, and Remaining.</w:t>
+        <w:t>The file contains one row per item with Item Name, Priority, Qty, Price/ea, Line Total, and supplier link, plus a summary block showing Order Total, Budget, and Remaining.</w:t>
       </w:r>
     </w:p>
     <w:p>
       <w:pPr>
-        <w:pStyle w:val="Heading3"/>
+        <w:pStyle w:val="Heading4"/>
       </w:pPr>
       <w:r>
-        <w:t>Opening the Export in Google Sheets</w:t>
-      </w:r>
-    </w:p>
-    <w:p>
-      <w:r>
-        <w:t>After downloading the file, follow these steps to open it in Google Sheets:</w:t>
+        <w:t>Opening the export in Google Sheets</w:t>
       </w:r>
     </w:p>
     <w:p>
@@ -665,7 +477,7 @@
         <w:pStyle w:val="ListNumber"/>
       </w:pPr>
       <w:r>
-        <w:t>Click Blank spreadsheet to open a new sheet, then go to File → Import.</w:t>
+        <w:t>Open a blank spreadsheet, then go to File → Import.</w:t>
       </w:r>
     </w:p>
     <w:p>
@@ -673,7 +485,7 @@
         <w:pStyle w:val="ListNumber"/>
       </w:pPr>
       <w:r>
-        <w:t>Select the Upload tab and drag the downloaded .xlsx file in, or click Browse to locate it.</w:t>
+        <w:t>Select Upload and drag the downloaded file in, or click Browse to find it.</w:t>
       </w:r>
     </w:p>
     <w:p>
@@ -682,14 +494,6 @@
       </w:pPr>
       <w:r>
         <w:t>Under Import location choose Replace spreadsheet, then click Import data.</w:t>
-      </w:r>
-    </w:p>
-    <w:p>
-      <w:pPr>
-        <w:pStyle w:val="ListNumber"/>
-      </w:pPr>
-      <w:r>
-        <w:t>The order opens as a fully editable Google Sheet — add notes, share it with others, or print it from there.</w:t>
       </w:r>
     </w:p>
     <w:p>
@@ -708,10 +512,10 @@
         <w:rPr>
           <w:b/>
         </w:rPr>
-        <w:t xml:space="preserve">◆ LOCK IN ORDER — </w:t>
+        <w:t xml:space="preserve">◆ LOCK IN ORDER </w:t>
       </w:r>
       <w:r>
-        <w:t>snapshots the order and moves it to the Monitoring tab for shipment tracking.</w:t>
+        <w:t>— snapshots the order and moves it to Monitoring for tracking.</w:t>
       </w:r>
     </w:p>
     <w:p>
@@ -724,7 +528,7 @@
     </w:p>
     <w:p>
       <w:r>
-        <w:t>This tab tracks a locked order from placement through delivery and final approval.</w:t>
+        <w:t>Tracks a locked order from placement through delivery and approval.</w:t>
       </w:r>
     </w:p>
     <w:p>
@@ -756,7 +560,7 @@
         <w:t xml:space="preserve">Mark as Placed — </w:t>
       </w:r>
       <w:r>
-        <w:t>after submitting the order to the supplier, click this to record that the order is in.</w:t>
+        <w:t>after submitting the order to the supplier, click this.</w:t>
       </w:r>
     </w:p>
     <w:p>
@@ -770,7 +574,7 @@
         <w:t xml:space="preserve">Shipment Tracking — </w:t>
       </w:r>
       <w:r>
-        <w:t>enter the tracking number once the supplier provides it. The app auto-detects the carrier (UPS, USPS, FedEx, DHL) and shows a link to the carrier's tracking page. Set an estimated delivery date to see a countdown. Manually advance the shipment stage as updates come in: Label Created → In Transit → Out for Delivery → Delivered.</w:t>
+        <w:t>enter the tracking number once the supplier provides it. The app auto-detects the carrier (UPS, USPS, FedEx, DHL) and links directly to the carrier's tracking page. Set an estimated delivery date to see a countdown. Advance the stage manually: Label Created → In Transit → Out for Delivery → Delivered.</w:t>
       </w:r>
     </w:p>
     <w:p>
@@ -784,7 +588,7 @@
         <w:t xml:space="preserve">Mark as Arrived — </w:t>
       </w:r>
       <w:r>
-        <w:t>when the package arrives, click this, then work through the item checklist to verify everything against the packing list.</w:t>
+        <w:t>when the package arrives, click this, then tick off each item on the checklist as you verify it against the packing list.</w:t>
       </w:r>
     </w:p>
     <w:p>
@@ -798,7 +602,7 @@
         <w:t xml:space="preserve">Returns — </w:t>
       </w:r>
       <w:r>
-        <w:t>if any items need to go back to the supplier, use Add Return to log the item and quantity.</w:t>
+        <w:t>if any items need to go back, use Add Return to log the item and quantity (whole numbers only).</w:t>
       </w:r>
     </w:p>
     <w:p>
@@ -812,7 +616,7 @@
         <w:t xml:space="preserve">Approve Order — </w:t>
       </w:r>
       <w:r>
-        <w:t>once the order is marked both Placed and Arrived, the Approve button becomes active. Clicking it writes the received quantities to the On Hand column in the sheet and creates a permanent order record tab. This action cannot be undone — only approve once everything is verified.</w:t>
+        <w:t>active once the order is Placed, Arrived, and at least one item is marked received. Clicking it writes received quantities to the On Hand column in the sheet and creates a permanent order record. This cannot be undone — only approve once everything is verified.</w:t>
       </w:r>
     </w:p>
     <w:p>
@@ -825,7 +629,7 @@
     </w:p>
     <w:p>
       <w:r>
-        <w:t>The app shows a countdown to the second Tuesday of each month — the standard order cycle date. Use this to gauge urgency.</w:t>
+        <w:t>The app shows a countdown to the second Tuesday of each month — the standard order cycle date.</w:t>
       </w:r>
     </w:p>
     <w:p>
@@ -838,7 +642,7 @@
     </w:p>
     <w:p>
       <w:r>
-        <w:t>The Demand Editor lets an administrator temporarily override demand levels used for status and order calculations, without changing the master sheet.</w:t>
+        <w:t>Lets an administrator temporarily adjust demand levels used for status and order calculations, without changing the master sheet.</w:t>
       </w:r>
     </w:p>
     <w:p>
@@ -849,22 +653,12 @@
         <w:t xml:space="preserve">To access: </w:t>
       </w:r>
       <w:r>
-        <w:t>Click the EDIT DEMAND button on the Inventory tab and enter the admin password.</w:t>
+        <w:t>Click EDIT DEMAND on the Inventory tab and enter the admin password.</w:t>
       </w:r>
     </w:p>
     <w:p>
       <w:r>
-        <w:t>Each item shows its sheet default alongside a local override field. Edit the values and click Save. Overrides are stored on the current device only — they do not sync to other users.</w:t>
-      </w:r>
-    </w:p>
-    <w:p>
-      <w:r>
-        <w:t>To clear all overrides, click Reset to Sheet Defaults.</w:t>
-      </w:r>
-    </w:p>
-    <w:p>
-      <w:r>
-        <w:t>To permanently change a demand level for everyone, edit Column E in the Google Sheet directly, then refresh the app.</w:t>
+        <w:t>Each item shows its current demand alongside an override field. Changes are stored on the current device only and do not affect other users. Click Reset to Sheet Defaults to clear all overrides. To change demand for everyone permanently, edit Column E in the Google Sheet directly, then refresh the app.</w:t>
       </w:r>
     </w:p>
     <w:p>
@@ -914,7 +708,7 @@
         <w:t xml:space="preserve">Export and submit — </w:t>
       </w:r>
       <w:r>
-        <w:t>Click ⬇ Export Order to download the .xlsx file, then submit to supplier.</w:t>
+        <w:t>Click Export Order, download the file, submit to supplier.</w:t>
       </w:r>
     </w:p>
     <w:p>
@@ -956,7 +750,7 @@
         <w:t xml:space="preserve">Enter tracking — </w:t>
       </w:r>
       <w:r>
-        <w:t>Add tracking number and estimated delivery date.</w:t>
+        <w:t>Add the tracking number and estimated delivery date.</w:t>
       </w:r>
     </w:p>
     <w:p>

</xml_diff>